<commit_message>
Convert EO manuscript citations to Taylor & Francis Chicago author-date.
Update the manuscript, review copy, supplementary materials, cover letter, length explanation, and related builders for the 2026-10-28 Chicago AD revision package. Leave zip archives and local backup trees untracked.
</commit_message>
<xml_diff>
--- a/paper/eo_submission/EO_submission_manuscript.docx
+++ b/paper/eo_submission/EO_submission_manuscript.docx
@@ -93,7 +93,7 @@
           <w:color w:val="000000"/>
           <w:sz w:val="18"/>
         </w:rPr>
-        <w:t>³ School of Computer Science and Software, Zhaoqing University, Zhaoqing 526061, China</w:t>
+        <w:t>³ School of Computer Science and Mathematics, Fujian University of Technology, Fuzhou 350118, China</w:t>
       </w:r>
     </w:p>
     <w:p>
@@ -124,6 +124,66 @@
           <w:sz w:val="18"/>
         </w:rPr>
         <w:t>* Corresponding author: Jeng-Shyang Pan, 100112@nuist.edu.cn</w:t>
+      </w:r>
+    </w:p>
+    <w:p>
+      <w:pPr>
+        <w:keepNext w:val="0"/>
+        <w:spacing w:before="0" w:after="20" w:line="240" w:lineRule="auto"/>
+        <w:jc w:val="center"/>
+      </w:pPr>
+      <w:r>
+        <w:rPr>
+          <w:rFonts w:ascii="Times New Roman" w:hAnsi="Times New Roman"/>
+          <w:color w:val="000000"/>
+          <w:sz w:val="18"/>
+        </w:rPr>
+        <w:t>Shu-Chuan Chu, 100130@nuist.edu.cn</w:t>
+      </w:r>
+    </w:p>
+    <w:p>
+      <w:pPr>
+        <w:keepNext w:val="0"/>
+        <w:spacing w:before="0" w:after="20" w:line="240" w:lineRule="auto"/>
+        <w:jc w:val="center"/>
+      </w:pPr>
+      <w:r>
+        <w:rPr>
+          <w:rFonts w:ascii="Times New Roman" w:hAnsi="Times New Roman"/>
+          <w:color w:val="000000"/>
+          <w:sz w:val="18"/>
+        </w:rPr>
+        <w:t>Ya-Yu Zhang, 202412492223@nuist.edu.cn</w:t>
+      </w:r>
+    </w:p>
+    <w:p>
+      <w:pPr>
+        <w:keepNext w:val="0"/>
+        <w:spacing w:before="0" w:after="20" w:line="240" w:lineRule="auto"/>
+        <w:jc w:val="center"/>
+      </w:pPr>
+      <w:r>
+        <w:rPr>
+          <w:rFonts w:ascii="Times New Roman" w:hAnsi="Times New Roman"/>
+          <w:color w:val="000000"/>
+          <w:sz w:val="18"/>
+        </w:rPr>
+        <w:t>Zhenyu Meng, zy.meng@fjut.edu.cn</w:t>
+      </w:r>
+    </w:p>
+    <w:p>
+      <w:pPr>
+        <w:keepNext w:val="0"/>
+        <w:spacing w:before="0" w:after="20" w:line="240" w:lineRule="auto"/>
+        <w:jc w:val="center"/>
+      </w:pPr>
+      <w:r>
+        <w:rPr>
+          <w:rFonts w:ascii="Times New Roman" w:hAnsi="Times New Roman"/>
+          <w:color w:val="000000"/>
+          <w:sz w:val="18"/>
+        </w:rPr>
+        <w:t>Jia Zhao, zhaojia@juwp.edu.cn</w:t>
       </w:r>
     </w:p>
     <w:p>
@@ -172,7 +232,7 @@
           <w:color w:val="000000"/>
           <w:sz w:val="22"/>
         </w:rPr>
-        <w:t>Surrogate-assisted engineering optimization spends its budget on decisions as much as on predictions: a monitoring signal can redirect finite-element analyses without improving the design while its calibration diagnostic appears satisfactory. A decision-consequence audit is developed as a decision-support procedure that separates three questions: calibration on the data a signal encounters, change in candidate selection and immediate utility at a common optimization state, and improvement of the closed loop. Exact decision equivalence supplies the allocation rule: reporting every immediate utility exactly needs one query per distinct context-point pair, so a frozen 120-state intervention is reported from 138 paid finite-element solves instead of 480, and no exact procedure can do so with fewer queries. Applied to a temporal residual monitor, the audit shows that its candidate-independent additive correction preserves exploitation ranking, so the effective pathway is an exploration controller rather than a distinct exploitation ranking. Across all 24 noiseless Black-Box Optimization Benchmarking (BBOB) functions in dimensions 10, 20 and 40 the controller fails the prespecified optimization-benefit gate while its selected-point failure fraction stays near the nominal level. A 200-evaluation finite-element beam study with eight methods and ten repeats reaches the same conclusion; under a shared 58-point initialization, Gaussian-process probability of improvement (GP-PI), author-code relation-model-assisted evolutionary search (DRSO) and trust-region Bayesian optimization (TuRBO-1) reduce median compliance by 51.7%, 74.7% and 75.1%, whereas Gaussian-process expected improvement (GP-EI) and fixed-multiplier GP upper confidence bound (GP-UCB) show none. One declared promotion rule over the three recorded acquisition rules returns one promotion, one stop and one held-for-revision verdict: the procedure rejects an unhelpful mechanism and certifies a usable one before large simulation budgets are committed.</w:t>
+        <w:t>Surrogate-assisted optimization spends its budget on which engineering simulation is evaluated next. Error diagnostics often look fine while search actions stay redundant or harmful, so paid solves yield little design gain. The process increment is a decision-consequence audit that asks whether an evaluation is justified before release. Calibration, selected-design change and immediate utility, and closed-loop improvement are scored apart. Exact decision equivalence gives the smallest extra simulation count: a frozen 120-state beam intervention is reported from 138 finite-element solves instead of 480. A post-hoc rule returns one promotion, one stop, and one held-for-revision verdict; thresholds are illustrative. PEM-T is the adversarial case: a near-calibrated temporal residual monitor that fails the optimization-benefit gate, yet the audit can block that decision-useless signal before it burns finite-element budget. In a 200-evaluation beam study, GP-PI, DRSO, and TuRBO-1 reduce median compliance by 51.7%, 74.7%, and 75.1%, whereas GP-EI and fixed-multiplier GP-UCB do not.</w:t>
       </w:r>
     </w:p>
     <w:p>
@@ -203,6 +263,24 @@
     </w:p>
     <w:p>
       <w:pPr>
+        <w:keepNext w:val="0"/>
+        <w:spacing w:before="0" w:after="60" w:line="240" w:lineRule="auto"/>
+        <w:ind w:firstLine="317"/>
+        <w:jc w:val="both"/>
+      </w:pPr>
+      <w:r>
+        <w:rPr>
+          <w:rFonts w:ascii="Times New Roman" w:hAnsi="Times New Roman"/>
+          <w:b w:val="0"/>
+          <w:i w:val="0"/>
+          <w:color w:val="000000"/>
+          <w:sz w:val="22"/>
+        </w:rPr>
+        <w:t>Word count: 9291 words, inclusive of tables, references and figure captions.</w:t>
+      </w:r>
+    </w:p>
+    <w:p>
+      <w:pPr>
         <w:pStyle w:val="Heading1"/>
         <w:keepNext/>
         <w:spacing w:before="240" w:after="60" w:line="240" w:lineRule="auto"/>
@@ -234,7 +312,7 @@
           <w:color w:val="000000"/>
           <w:sz w:val="22"/>
         </w:rPr>
-        <w:t>Many engineering optimization problems depend on simulations, model training, or experiments whose evaluations dominate the available computational or physical budget. Surrogate-assisted evolutionary algorithms and Bayesian optimization reduce this burden by fitting an inexpensive predictive model and deciding which candidate should receive the next exact evaluation [1-5]. Model management is therefore the operational core of surrogate assistance: surrogate prediction is converted into an acquisition or management decision, that decision allocates a paid evaluation, and the resulting label changes the subsequent optimization state. A reliable predictor is useful only when this chain improves the use of the available budget.</w:t>
+        <w:t>Many engineering optimization problems hang on simulations, model training, or experiments. Those evaluations often dominate the computational or physical budget. Surrogate-assisted evolutionary algorithms and Bayesian optimization cut the load by fitting a cheap predictor and choosing which candidate gets the next exact evaluation (Jin 2011; Jin et al. 2019; Jones, Schonlau, and Welch 1998; Li, Zhan, and Zhang 2022; Liang et al. 2025). Model management turns prediction into an acquisition or management decision, spends a paid evaluation, and folds the label into the optimization state. Only then does a reliable predictor improve budget use.</w:t>
       </w:r>
     </w:p>
     <w:p>
@@ -252,7 +330,7 @@
           <w:color w:val="000000"/>
           <w:sz w:val="22"/>
         </w:rPr>
-        <w:t>This distinction matters directly in simulation-based engineering design. A monitoring signal can redirect finite-element analyses without improving structural performance, even when its aggregate error diagnostic appears satisfactory. Reliable regional Kriging search has connected uncertainty to restricted search regions and infill decisions [35], while diagnostic benchmarking has exposed differences between standard-test and real-application algorithm performance [34]. These studies motivate inspection of the route from surrogate information to paid engineering evaluations. The present beam application examines this route within a constrained design family; broader relevance to materials, manufacturing, robotics, and neural architecture search remains motivation rather than application validation in this study.</w:t>
+        <w:t>Simulation-based engineering design makes the gap tangible. A monitoring signal can redirect finite-element analyses and still leave structural performance flat, even when aggregate error looks satisfactory. Predictive accuracy and optimization utility can diverge. On expensive workflows that split is an operational risk: teams may pour simulation budget into candidates from a well-calibrated yet decision-redundant surrogate system. Reliable regional Kriging search has tied uncertainty to restricted regions and infill decisions (Suprayitno and Yu 2019). Diagnostic benchmarking has shown standard-test and real-application algorithm behavior can differ (Zatarain Salazar et al. 2025). Both push inspection of the path from surrogate information to paid engineering evaluations. The beam study here stays inside a constrained design family. Materials, manufacturing, robotics, and neural architecture search remain motivation, not validated applications.</w:t>
       </w:r>
     </w:p>
     <w:p>
@@ -270,7 +348,7 @@
           <w:color w:val="000000"/>
           <w:sz w:val="22"/>
         </w:rPr>
-        <w:t>Recent methods use Gaussian-process uncertainty, ensembles, local models, temporal information, or adaptive infill rules to balance exploitation and exploration [6-11]. Online and conformal calibration research asks whether predictive distributions or bounds retain their intended reliability under sequential selection [12-15]. Calibration alone, however, does not establish that a signal changes candidate ordering, selects a better candidate at the same state, or improves a closed-loop trajectory after the surrogate and candidate distribution adapt. These properties form a decision pathway and must be evaluated separately.</w:t>
+        <w:t>Uncertainty, ensembles, local models, temporal signals, and adaptive infill all appear in methods that trade exploitation against exploration (H. Liu et al. 2025; Q. Liu et al. 2021; Ma et al. 2025; L. Yu et al. 2026; Zhou et al. 2025; Zou et al. 2025). Online and conformal calibration ask whether predictive bounds keep intended reliability under sequential selection (Deshpande, Marx, and Kuleshov 2024; Jin and Ren 2025; Kim et al. 2025; Nardone et al. 2026). Passing a calibration check is not enough. It does not prove that a signal reorders candidates, picks a better design at a fixed state, or improves a closed-loop trajectory after the surrogate adapts. Those decision-pathway claims need separate tests.</w:t>
       </w:r>
     </w:p>
     <w:p>
@@ -288,7 +366,7 @@
           <w:color w:val="000000"/>
           <w:sz w:val="22"/>
         </w:rPr>
-        <w:t>A decision-consequence auditing framework is developed for that purpose. The representative temporal post-selection error monitor records predictions before labels, estimates an empirical residual bound, and converts failures, bound width, and stagnation into spatial exploration. The framework is not tied to that monitor: it accepts any surrogate, candidate generator, monitoring signal, and acquisition or model-management rule whose pathway to paid evaluations can be inspected. The monitored controller supplies a demanding case because its calibration diagnostic appears plausible while its decision pathway contains an algebraically redundant exploitation term.</w:t>
+        <w:t>PEM-T, the prediction-error-monitoring prototype, is an adversarial controller for the audit. Its residual monitor hits a near-target calibration signal. Yet an algebraically redundant exploitation term sits in the decision pathway and steers spatial exploration the wrong way. The failure is useful, not ornamental. At a common-state layer the audit can catch that pattern before a large closed-loop finite-element budget is spent. Nothing in the procedure depends on PEM-T alone. Any surrogate, candidate generator, monitoring signal, and acquisition or model-management rule can be inspected if its path to paid evaluations is recorded.</w:t>
       </w:r>
     </w:p>
     <w:p>
@@ -306,7 +384,7 @@
           <w:color w:val="000000"/>
           <w:sz w:val="22"/>
         </w:rPr>
-        <w:t>The contribution is a decision-support procedure and its records rather than an optimizer: it specifies the evidence a surrogate-management claim needs before it can be called an engineering improvement, together with the cost of obtaining that evidence. The four elements are as follows.</w:t>
+        <w:t>What follows is a decision-support audit with records. It states the evidence—and its cost—needed before a surrogate-management claim counts as an engineering improvement. Four elements follow.</w:t>
       </w:r>
     </w:p>
     <w:p>
@@ -324,7 +402,7 @@
           <w:color w:val="000000"/>
           <w:sz w:val="22"/>
         </w:rPr>
-        <w:t>1. An allocation rule for exact decision reporting gives the formal result. Policies that select the same exact point in the same deterministic objective context share one response, and Proposition 1 establishes the worst-case minimum query count for reporting every immediate utility exactly. The implementation collapses 480 GP control-state choices to 261 within-state distinct choices and then to 138 additional finite-element calls, so the same report costs 138 paid solves instead of 480, and no exact procedure can do so with fewer queries. 2. An executable audit separates structural decision influence, frozen-state intervention effects, finite-horizon policy performance, and complete physical-call cost. Each stage returns an explicit evidence object and an unsupported-claim boundary, so prediction quality is never substituted for optimization value. 3. A recorded-verdict layer applies one declared promotion rule to the three frozen acquisition rules and returns one promotion, one stop and one held-for-revision verdict, so the procedure is shown to discriminate rather than only to reject. Prediction-before-label records, fixed information boundaries and the separated paid-call ledger keep every verdict auditable; the elementary additive-ranking invariant is a screening case, not the mathematical contribution. 4. Beyond the residual-monitor case, a frozen 120-state GP acquisition intervention and twenty separately initialized transfer cases under two previously untested beam load positions test actionable rules and longer horizons. They distinguish zero first-step gain from later policy improvement and quantify the performance loss and extra cost hidden by an unqualified claim of cheaper strategy selection. This evidence remains separate from the original statistical families.</w:t>
+        <w:t>1. An allocation rule for exact decision reporting: policies that select the same exact point in the same deterministic objective context share one response, and Proposition 1 gives the worst-case minimum query count. The implementation collapses 480 GP control-state choices through 261 within-state distinct choices to 138 additional finite-element calls, so the same report costs 138 paid solves instead of 480, and no exact procedure uses fewer queries. 2. An executable audit separates structural decision influence, frozen-state intervention effects, finite-horizon policy performance, and complete physical-call cost. Each stage returns an explicit evidence object and an unsupported-claim boundary, so prediction quality is never substituted for optimization value. 3. A recorded-verdict layer applies one declared promotion rule to three frozen acquisition rules, returning one promotion, one stop and one held-for-revision verdict. Written after those records existed, its thresholds are illustrative and separate from the prespecified optimization-benefit gate (failed by the residual monitor). Prediction-before-label records, fixed information boundaries and the paid-call ledger keep every verdict auditable; the elementary additive-ranking invariant is a screening case, not the mathematical contribution. 4. Beyond the residual-monitor case, a frozen 120-state GP acquisition intervention and twenty transfer cases under two previously untested beam load positions test actionable rules and longer horizons. They distinguish zero first-step gain from later policy improvement and quantify the performance loss and extra cost hidden by an unqualified claim of cheaper strategy selection.</w:t>
       </w:r>
     </w:p>
     <w:p>
@@ -342,7 +420,7 @@
           <w:color w:val="000000"/>
           <w:sz w:val="22"/>
         </w:rPr>
-        <w:t>Algorithm 1 specifies the audit procedure and its required evidence. The contribution is an implemented intervention-and-verification method for surrogate-management mechanisms; no acquisition function or universally superior strategy selector is introduced. Section 2.3 relates its evidence objects to existing model management, diagnostic benchmarking, and algorithm selection; Sections 6.3-6.5 provide the additional GP evidence. Because every stage returns a costed verdict, the procedure is addressed to engineering design teams that must justify simulation expenditure before a batch of solves is released, not only to benchmark comparison.</w:t>
+        <w:t>Algorithm 1 lays out the audit steps and required evidence. What is contributed is an implemented intervention-and-verification method for surrogate-management mechanisms; no acquisition function or universally superior strategy selector is introduced. Section 2.3 situates the evidence objects; Sections 6.3-6.5 add the GP evidence. Each stage returns a costed verdict, so teams that must justify simulation spend before releasing a batch of solves have an explicit promote, revise, or stop point.</w:t>
       </w:r>
     </w:p>
     <w:p>
@@ -360,7 +438,7 @@
           <w:color w:val="000000"/>
           <w:sz w:val="22"/>
         </w:rPr>
-        <w:t>Here, reliability refers to the credibility and utility of surrogate-management decisions. It does not denote reliability-based design optimization with structural failure probabilities or probabilistic safety constraints.</w:t>
+        <w:t>Reliability, as used here, means credibility and utility of surrogate-management decisions. It does not mean reliability-based design optimization with structural failure probabilities or probabilistic safety constraints.</w:t>
       </w:r>
     </w:p>
     <w:p>
@@ -378,7 +456,7 @@
           <w:color w:val="000000"/>
           <w:sz w:val="22"/>
         </w:rPr>
-        <w:t>The claims are deliberately bounded. The empirical residual quantile is not presented as a conformal coverage theorem, false-discovery guarantee, regret bound, or universally effective high-dimensional method. The case-study findings concern a deterministic, single-objective setting, the stated surrogate and candidate process, and the tested budgets. The framework itself supplies a structured test procedure; it does not imply that candidate-dependent uncertainty, expected improvement, confidence bounds, restarts, stopping rules, or uncertainty-aware optimization in general are ineffective.</w:t>
+        <w:t>Bounds on the claims are strict. The empirical residual quantile is not a conformal coverage theorem, false-discovery guarantee, regret bound, or universally effective high-dimensional method. Findings concern a deterministic single-objective setting, the stated surrogate and candidate process, and the tested budgets. This is a structured test procedure. It does not imply that candidate-dependent uncertainty, expected improvement, confidence bounds, restarts, stopping rules, or uncertainty-aware optimization in general are ineffective.</w:t>
       </w:r>
     </w:p>
     <w:p>
@@ -414,7 +492,7 @@
           <w:color w:val="000000"/>
           <w:sz w:val="22"/>
         </w:rPr>
-        <w:t>2.1 Surrogate-assisted optimization and engineering applications</w:t>
+        <w:t>2.1 Surrogate-assisted optimization and model management</w:t>
       </w:r>
     </w:p>
     <w:p>
@@ -432,7 +510,25 @@
           <w:color w:val="000000"/>
           <w:sz w:val="22"/>
         </w:rPr>
-        <w:t>Surrogate-assisted evolutionary computation has developed a broad range of models and management policies for expensive optimization [1,2]. Early frameworks combined evolutionary search with approximate fitness functions or Gaussian-process surrogates [3,16]. Later work introduced selective ensembles, local/global models, classification-assisted search, and adaptive infill rules [4,5,17-19]. Differential evolution remains a common search engine in this area; the taxonomy and empirical evidence synthesized by Pan et al. [31] show that exponential-crossover behavior depends strongly on operator design and parameter control. A recent survey identifies model construction and model management as separate determinants of performance [2]. Controlled experiments with adjustable surrogate accuracy likewise show that prediction accuracy affects preselection, individual-based, and generation-based management differently [20].</w:t>
+        <w:t>Surrogate-assisted evolutionary algorithms (SAEAs) and Bayesian optimization reduce the evaluation burden of expensive black-box simulations (Jin 2011; Jin et al. 2019; Jones, Schonlau, and Welch 1998; Li, Zhan, and Zhang 2022; Liang et al. 2025). Model management converts predictions into sampling or selection decisions. Early work combined approximate fitness with generation-based control (Jones, Schonlau, and Welch 1998; Ong, Nair, and Keane 2003). Committee-based active learning (H. Wang, Jin, and Doherty 2017) and cooperative swarm SAEAs for high-dimensional problems (Sun et al. 2017) extended that line. Later designs introduced boosting Gaussian-process uncertainty (Zou et al. 2025), large-scale lower-confidence-bound models with diversity search (Ma et al. 2025), and relation models that retain unevaluated population information (DRSO) (Hao, Zhang, and Zhou 2024), consistent with evidence that unevaluated solutions can remain valuable under expensive budgets (Hao, Zhang, and Zhou 2025). Hierarchical surrogate evaluation appears in adjacent settings such as neural architecture search (X. Liu, Bao, and Leng 2025). Grouping multilayer-perceptron with sparse Gaussian-process SAEAs targets expensive multiobjective problems (Pan, Peng, et al. 2026). Parallel comparisons of Bayesian, evolutionary, and hybrid solvers under wall-clock limits show that model-management choices interact with time-constrained workflows (Gobert et al. 2024). The same paradigms already appear in multi-objective robotic linkage design (Ibrayev et al. 2024), laser-welding parameter selection (Z. Wang et al. 2025), and multi-UAV path planning (R.-Y. Wang et al. 2026). Hanawa, Harada, and Miura (2025) showed that prediction accuracy affects preselection, individual-based, and generation-based management unevenly. Surrogate information therefore needs a check at the decision layer: it is valuable only when it guides paid physical evaluations.</w:t>
+      </w:r>
+    </w:p>
+    <w:p>
+      <w:pPr>
+        <w:pStyle w:val="Heading2"/>
+        <w:keepNext/>
+        <w:spacing w:before="160" w:after="60" w:line="240" w:lineRule="auto"/>
+        <w:jc w:val="left"/>
+      </w:pPr>
+      <w:r>
+        <w:rPr>
+          <w:rFonts w:ascii="Times New Roman" w:hAnsi="Times New Roman"/>
+          <w:b/>
+          <w:i/>
+          <w:color w:val="000000"/>
+          <w:sz w:val="22"/>
+        </w:rPr>
+        <w:t>2.2 Reliability quantification and operational benchmarking</w:t>
       </w:r>
     </w:p>
     <w:p>
@@ -450,79 +546,7 @@
           <w:color w:val="000000"/>
           <w:sz w:val="22"/>
         </w:rPr>
-        <w:t>Engineering applications show how these ideas enter expensive computational workflows. Hierarchical surrogate evaluation reduces neural-architecture search cost [27], deep surrogate models support multi-objective robotic linkage design [28], and physics-informed Gaussian-process regression with adaptive Bayesian optimization combines finite-element knowledge with welding-parameter selection [29]. Surrogate-assisted particle swarm optimization (PSO) has also been applied to multi-unmanned-aerial-vehicle (multi-UAV) path planning [33]. These studies motivate reliability checks at the decision layer because prediction accuracy and evaluation savings are valuable only when surrogate outputs lead to useful paid evaluations.</w:t>
-      </w:r>
-    </w:p>
-    <w:p>
-      <w:pPr>
-        <w:keepNext w:val="0"/>
-        <w:spacing w:before="0" w:after="60" w:line="240" w:lineRule="auto"/>
-        <w:ind w:firstLine="317"/>
-        <w:jc w:val="both"/>
-      </w:pPr>
-      <w:r>
-        <w:rPr>
-          <w:rFonts w:ascii="Times New Roman" w:hAnsi="Times New Roman"/>
-          <w:b w:val="0"/>
-          <w:i w:val="0"/>
-          <w:color w:val="000000"/>
-          <w:sz w:val="22"/>
-        </w:rPr>
-        <w:t>Uncertainty-aware surrogate-assisted evolutionary algorithms (SAEAs) typically make uncertainty candidate dependent. The boosting Gaussian-process SAEA (BGP-SAEA) combines a boosting framework with Gaussian-process uncertainty [6], while recent large-scale methods use lower-confidence-bound Gaussian-process models and diversity search [7]. For expensive multi-objective optimization, the multilayer-perceptron sparse-Gaussian-process SAEA (MLPSGP-SAEA) combines multilayer-perceptron variable grouping, sparse Gaussian processes, and an adaptive sparse-and-diverse infill criterion [32]. Other work adapts differential-evolution selection to errors in both decision and objective spaces [8], tightens the search space for high-dimensional expensive problems [9], or draws on multiple spatial, temporal, and performance information sources [10]. These mechanisms can change candidate ranking, local search regions, or population updates.</w:t>
-      </w:r>
-    </w:p>
-    <w:p>
-      <w:pPr>
-        <w:keepNext w:val="0"/>
-        <w:spacing w:before="0" w:after="60" w:line="240" w:lineRule="auto"/>
-        <w:ind w:firstLine="317"/>
-        <w:jc w:val="both"/>
-      </w:pPr>
-      <w:r>
-        <w:rPr>
-          <w:rFonts w:ascii="Times New Roman" w:hAnsi="Times New Roman"/>
-          <w:b w:val="0"/>
-          <w:i w:val="0"/>
-          <w:color w:val="000000"/>
-          <w:sz w:val="22"/>
-        </w:rPr>
-        <w:t>Competitive SAEAs also use evolutionary populations and learned relations rather than a scalar acquisition alone. The relation-model-assisted evolutionary algorithm (DRSO) retains unevaluated promising solutions in a relation-model-assisted evolutionary loop to preserve useful population information under expensive-evaluation budgets [30]. Its public author implementation makes it suitable for a source-frozen engineering comparison, while its distinct population mechanism broadens the evidence beyond Gaussian-process acquisitions.</w:t>
-      </w:r>
-    </w:p>
-    <w:p>
-      <w:pPr>
-        <w:pStyle w:val="Heading2"/>
-        <w:keepNext/>
-        <w:spacing w:before="160" w:after="60" w:line="240" w:lineRule="auto"/>
-        <w:jc w:val="left"/>
-      </w:pPr>
-      <w:r>
-        <w:rPr>
-          <w:rFonts w:ascii="Times New Roman" w:hAnsi="Times New Roman"/>
-          <w:b/>
-          <w:i/>
-          <w:color w:val="000000"/>
-          <w:sz w:val="22"/>
-        </w:rPr>
-        <w:t>2.2 Reliability-aware surrogate model management</w:t>
-      </w:r>
-    </w:p>
-    <w:p>
-      <w:pPr>
-        <w:keepNext w:val="0"/>
-        <w:spacing w:before="0" w:after="60" w:line="240" w:lineRule="auto"/>
-        <w:ind w:firstLine="317"/>
-        <w:jc w:val="both"/>
-      </w:pPr>
-      <w:r>
-        <w:rPr>
-          <w:rFonts w:ascii="Times New Roman" w:hAnsi="Times New Roman"/>
-          <w:b w:val="0"/>
-          <w:i w:val="0"/>
-          <w:color w:val="000000"/>
-          <w:sz w:val="22"/>
-        </w:rPr>
-        <w:t>Bayesian optimization has incorporated online calibration. Deshpande et al. [12] calibrate predictive distributions and update them online. Localized online conformal Bayesian optimization constructs spatially varying thresholds and a calibrated posterior [13]. Selection-conditional methods use reference sets under explicit invariance and exchangeability conditions [14]. Temporal conformal prediction has also been considered in surrogate-assisted evolutionary optimization [15]. The cross-model residual journal examined here does not establish the assumptions required by those methods and is treated as an empirical monitor without transferred guarantees.</w:t>
+        <w:t>Bayesian optimization has incorporated online calibration through updated predictive distributions (Deshpande, Marx, and Kuleshov 2024), localized online conformal thresholds (Kim et al. 2025), and selection-conditional coverage under explicit exchangeability conditions (Jin and Ren 2025). Temporal conformal prediction has also been considered in surrogate-assisted evolutionary optimization (Nardone et al. 2026). Table 1 summarizes the scope: these approaches primarily guarantee marginal or localized coverage. Meeting a coverage guarantee does not by itself imply optimization utility or trajectory improvement after the surrogate adapts. Diagnostic benchmarking (Zatarain Salazar et al. 2025) evaluates cross-application runtime dynamics. Two-step lookahead optimizes short model-based horizons (Wu and Frazier 2019). Neither isolates counterfactual choices at a fixed learned state. The costed validation protocol used here makes the decision pathway falsifiable before expensive solvers are released.</w:t>
       </w:r>
     </w:p>
     <w:p>
@@ -1405,24 +1429,6 @@
     </w:p>
     <w:p>
       <w:pPr>
-        <w:keepNext w:val="0"/>
-        <w:spacing w:before="0" w:after="60" w:line="240" w:lineRule="auto"/>
-        <w:ind w:firstLine="317"/>
-        <w:jc w:val="both"/>
-      </w:pPr>
-      <w:r>
-        <w:rPr>
-          <w:rFonts w:ascii="Times New Roman" w:hAnsi="Times New Roman"/>
-          <w:b w:val="0"/>
-          <w:i w:val="0"/>
-          <w:color w:val="000000"/>
-          <w:sz w:val="22"/>
-        </w:rPr>
-        <w:t>Several studies compare Bayesian, evolutionary, and hybrid surrogate strategies under constrained budgets [21], and others show that unevaluated but surrogate-predicted candidates can influence evolutionary diversity [22]. These optimizers are complementary to the present audit. A change in a coupled trajectory does not, by itself, isolate what the mechanism would have selected at the same learned state. The additional GP intervention freezes that state and candidate pool before consulting alternative outcomes, then evaluates longer-horizon policies separately.</w:t>
-      </w:r>
-    </w:p>
-    <w:p>
-      <w:pPr>
         <w:pStyle w:val="Heading2"/>
         <w:keepNext/>
         <w:spacing w:before="160" w:after="60" w:line="240" w:lineRule="auto"/>
@@ -1454,25 +1460,7 @@
           <w:color w:val="000000"/>
           <w:sz w:val="22"/>
         </w:rPr>
-        <w:t>Reliable regional Kriging supplies a variance-guided search region and adaptive infill mechanism [35]; surrogate-management frameworks can also provide convergence guarantees under their assumptions [38]. The present method does not replace these search rules or inherit their convergence guarantees. It evaluates the route from an existing rule to a paid action and the evidence needed to justify that route. Hanawa et al. [20] vary the accuracy of a pseudo-surrogate to compare management strategies. Here the intervention instead holds an actually learned GP state fixed and varies its acquisition rule; posterior uncertainty and training labels are not replaced by synthetic accuracy levels.</w:t>
-      </w:r>
-    </w:p>
-    <w:p>
-      <w:pPr>
-        <w:keepNext w:val="0"/>
-        <w:spacing w:before="0" w:after="60" w:line="240" w:lineRule="auto"/>
-        <w:ind w:firstLine="317"/>
-        <w:jc w:val="both"/>
-      </w:pPr>
-      <w:r>
-        <w:rPr>
-          <w:rFonts w:ascii="Times New Roman" w:hAnsi="Times New Roman"/>
-          <w:b w:val="0"/>
-          <w:i w:val="0"/>
-          <w:color w:val="000000"/>
-          <w:sz w:val="22"/>
-        </w:rPr>
-        <w:t>Diagnostic benchmarking [34] studies effectiveness, efficiency, reliability, parameter controllability, and runtime dynamics on real applications. The unit of intervention used here is the mechanism decision within a frozen optimization state, followed by a distinct policy-level validation. Algorithm selection and its data-acquisition cost are established topics [36,37]. In particular, trajectory-based warm-starting reuses search information when switching algorithms [37], and two-step lookahead optimises evaluation choice over a short model-based horizon rather than over the realized response of one action [39]. The twenty-step selection workflow deliberately discards pilot labels from validation training to measure selection transfer under an intact information boundary. It is a diagnostic case, not a claimed advance over warm-starting selectors; a production workflow could reuse pilot information and would require its own validation.</w:t>
+        <w:t>Reliable regional Kriging supplies variance-guided regions and adaptive infill (Suprayitno and Yu 2019). Other surrogate-management frameworks can provide convergence guarantees under their assumptions (Booker et al. 1999). The method here does not replace those rules or inherit their guarantees. It evaluates the route from an existing rule to a paid action and the evidence needed to justify that route. Hanawa, Harada, and Miura (2025) vary pseudo-surrogate accuracy across management strategies; the intervention below holds a learned GP state fixed and varies only the acquisition rule. Algorithm selection and trajectory warm-starting address a complementary problem (Kostovska et al. 2022; Kuş et al. 2024). The reusable technical object is the frozen decision record together with its equivalence classes, response ledger, and subsequent validation record. What is claimed is a diagnostic procedure, not an optimizer: outputs are verdicts with stated evidence and cost, and the only performance claims are the measured ones reported below.</w:t>
       </w:r>
     </w:p>
     <w:p>
@@ -1487,7 +1475,7 @@
           <w:color w:val="000000"/>
           <w:sz w:val="20"/>
         </w:rPr>
-        <w:t>Table 2: Relation to representative prior work and the evidence object added here. The comparison concerns the stated studies, not the absence of these ideas throughout the literature.</w:t>
+        <w:t>Table 2: Relation to representative prior work and the evidence object added here.</w:t>
       </w:r>
     </w:p>
     <w:tbl>
@@ -1623,7 +1611,9 @@
               <w:spacing w:after="0" w:line="240" w:lineRule="auto"/>
               <w:jc w:val="left"/>
             </w:pPr>
-            <w:r/>
+            <w:r>
+              <w:t>Reliable regional Kriging (Suprayitno and Yu 2019)</w:t>
+            </w:r>
             <w:r>
               <w:rPr>
                 <w:rFonts w:ascii="Times New Roman" w:hAnsi="Times New Roman"/>
@@ -1631,7 +1621,6 @@
                 <w:color w:val="000000"/>
                 <w:sz w:val="18"/>
               </w:rPr>
-              <w:t>Reliable regional Kriging [35]</w:t>
             </w:r>
           </w:p>
         </w:tc>
@@ -1713,7 +1702,9 @@
               <w:spacing w:after="0" w:line="240" w:lineRule="auto"/>
               <w:jc w:val="left"/>
             </w:pPr>
-            <w:r/>
+            <w:r>
+              <w:t>Surrogate management (Booker et al. 1999)</w:t>
+            </w:r>
             <w:r>
               <w:rPr>
                 <w:rFonts w:ascii="Times New Roman" w:hAnsi="Times New Roman"/>
@@ -1721,7 +1712,6 @@
                 <w:color w:val="000000"/>
                 <w:sz w:val="18"/>
               </w:rPr>
-              <w:t>Surrogate management [38]</w:t>
             </w:r>
           </w:p>
         </w:tc>
@@ -1804,7 +1794,9 @@
               <w:spacing w:after="0" w:line="240" w:lineRule="auto"/>
               <w:jc w:val="left"/>
             </w:pPr>
-            <w:r/>
+            <w:r>
+              <w:t>Adjustable-accuracy management study (Hanawa, Harada, and Miura 2025)</w:t>
+            </w:r>
             <w:r>
               <w:rPr>
                 <w:rFonts w:ascii="Times New Roman" w:hAnsi="Times New Roman"/>
@@ -1812,7 +1804,6 @@
                 <w:color w:val="000000"/>
                 <w:sz w:val="18"/>
               </w:rPr>
-              <w:t>Adjustable-accuracy management study [20]</w:t>
             </w:r>
           </w:p>
         </w:tc>
@@ -1894,7 +1885,9 @@
               <w:spacing w:after="0" w:line="240" w:lineRule="auto"/>
               <w:jc w:val="left"/>
             </w:pPr>
-            <w:r/>
+            <w:r>
+              <w:t>Diagnostic benchmarking (Zatarain Salazar et al. 2025)</w:t>
+            </w:r>
             <w:r>
               <w:rPr>
                 <w:rFonts w:ascii="Times New Roman" w:hAnsi="Times New Roman"/>
@@ -1902,7 +1895,6 @@
                 <w:color w:val="000000"/>
                 <w:sz w:val="18"/>
               </w:rPr>
-              <w:t>Diagnostic benchmarking [34]</w:t>
             </w:r>
           </w:p>
         </w:tc>
@@ -1931,7 +1923,7 @@
                 <w:color w:val="000000"/>
                 <w:sz w:val="18"/>
               </w:rPr>
-              <w:t>Effectiveness, efficiency, reliability, parameter controllability, and runtime dynamics across real applications</w:t>
+              <w:t>Effectiveness, efficiency, reliability, and runtime dynamics across real applications</w:t>
             </w:r>
           </w:p>
         </w:tc>
@@ -1985,7 +1977,9 @@
               <w:spacing w:after="0" w:line="240" w:lineRule="auto"/>
               <w:jc w:val="left"/>
             </w:pPr>
-            <w:r/>
+            <w:r>
+              <w:t>Two-step lookahead (Wu and Frazier 2019)</w:t>
+            </w:r>
             <w:r>
               <w:rPr>
                 <w:rFonts w:ascii="Times New Roman" w:hAnsi="Times New Roman"/>
@@ -1993,7 +1987,6 @@
                 <w:color w:val="000000"/>
                 <w:sz w:val="18"/>
               </w:rPr>
-              <w:t>Two-step lookahead [39]</w:t>
             </w:r>
           </w:p>
         </w:tc>
@@ -2075,7 +2068,9 @@
               <w:spacing w:after="0" w:line="240" w:lineRule="auto"/>
               <w:jc w:val="left"/>
             </w:pPr>
-            <w:r/>
+            <w:r>
+              <w:t>Frugal selection (Kuş et al. 2024) and trajectory warm-starting (Kostovska et al. 2022)</w:t>
+            </w:r>
             <w:r>
               <w:rPr>
                 <w:rFonts w:ascii="Times New Roman" w:hAnsi="Times New Roman"/>
@@ -2083,7 +2078,6 @@
                 <w:color w:val="000000"/>
                 <w:sz w:val="18"/>
               </w:rPr>
-              <w:t>Frugal selection [36] and trajectory warm-starting [37]</w:t>
             </w:r>
           </w:p>
         </w:tc>
@@ -2154,24 +2148,6 @@
     </w:p>
     <w:p>
       <w:pPr>
-        <w:keepNext w:val="0"/>
-        <w:spacing w:before="0" w:after="60" w:line="240" w:lineRule="auto"/>
-        <w:ind w:firstLine="317"/>
-        <w:jc w:val="both"/>
-      </w:pPr>
-      <w:r>
-        <w:rPr>
-          <w:rFonts w:ascii="Times New Roman" w:hAnsi="Times New Roman"/>
-          <w:b w:val="0"/>
-          <w:i w:val="0"/>
-          <w:color w:val="000000"/>
-          <w:sz w:val="22"/>
-        </w:rPr>
-        <w:t>The reusable technical object is the frozen decision record plus its equivalence classes, response ledger, and subsequent validation record. Neither logging, matched initialization, additive ranking invariance, nor counting diagnostic overhead is claimed as a standalone contribution. The methodological advance argued here is their joint use to make a signal-to-action claim falsifiable before treating it as demonstrated engineering-budget value. The paper therefore claims a diagnostic procedure, not an optimizer: its outputs are verdicts with stated evidence and cost, and its only performance claims are the measured ones reported below. The evidence tests that method on a residual controller and four GP acquisition policies; it does not establish general superiority across all surrogate or selector families.</w:t>
-      </w:r>
-    </w:p>
-    <w:p>
-      <w:pPr>
         <w:pStyle w:val="Heading1"/>
         <w:keepNext/>
         <w:spacing w:before="240" w:after="60" w:line="240" w:lineRule="auto"/>
@@ -2707,7 +2683,7 @@
           <w:color w:val="000000"/>
           <w:sz w:val="22"/>
         </w:rPr>
-        <w:t>The framework can return a positive result, and does so on recorded data. Classical GP acquisition is a candidate-dependent positive control because both its predicted improvement and its uncertainty vary across candidates, so it can change ranking and passes the structural decision-influence check; passing that first check does not guarantee superior endpoints, it authorizes empirical utility and closed-loop evaluation. Section 6.4 applies a declared promotion rule to the three recorded acquisition rules and reports one promotion, one stop and one held-for-revision verdict.</w:t>
+        <w:t>The framework can return a positive result, and does so on recorded data. Classical GP acquisition is a candidate-dependent positive control because both its predicted improvement and its uncertainty vary across candidates, so it can change ranking and passes the structural decision-influence check; passing that first check does not guarantee superior endpoints, it authorizes empirical utility and closed-loop evaluation. Section 6.4 applies a promotion rule written after the records existed and reports one promotion, one stop and one held-for-revision verdict. That reading is retrospective. The prespecified optimization-benefit gate for the residual monitor remains unmet.</w:t>
       </w:r>
     </w:p>
     <w:p>
@@ -3131,7 +3107,7 @@
           <w:color w:val="000000"/>
           <w:sz w:val="22"/>
         </w:rPr>
-        <w:t>4.1 Representative monitored optimizer and search framework</w:t>
+        <w:t>4.1 Audited monitor prototype and internal optimizer</w:t>
       </w:r>
     </w:p>
     <w:p>
@@ -3149,7 +3125,7 @@
           <w:color w:val="000000"/>
           <w:sz w:val="22"/>
         </w:rPr>
-        <w:t>A temporal residual monitor is used as the representative audited mechanism. For a selected point xₜ, the standardized signed residual is rₜ=[yₜ-μₜ(xₜ)]/sₜ, where sₜ is the standard deviation of the current training labels and is replaced by one if it is zero. Historical residuals retain their prediction-time models and scales. For candidate x, the monitor forms Hₜ(x)=μₜ(x)+sₜ qₜ(x), where qₜ(x) is the nonnegative weighted 0.9 quantile of at most the latest 100 residuals. Temporal weights have a half-life of 25 evaluations; spatial variants use a Gaussian kernel and an effective-sample-size support guard of 20.</w:t>
+        <w:t>A temporal residual monitor serves as the representative audited mechanism. For a selected candidate xₜ, the monitor records the standardized prediction residual rₜ. It then constructs a temporal upper value bound Hₜ(x)=μₜ(x)+sₜ qₜ(x), where qₜ(x) is the nonnegative weighted 0.9 quantile of recent historical residuals. The prediction-error-monitoring prototype with temporal weighting (PEM-T) converts these tracking signals and evaluation-stagnation flags into a dynamic exploration probability in [0.1, 0.8]. When exploring, PEM-T selects the candidate with the largest minimum distance to the archive; otherwise it uses the common-correction upper value Hₜ(x) when an improvement declaration is available and the monitor is not alarmed, and the predicted mean μₜ(x) in the remaining cases. By Lemma 1, the exploitation rankings of the upper-value and mean modes are algebraically identical under a candidate-independent correction. A fixed-exploration control retains the same model and candidate process with exploration probability 0.1.</w:t>
       </w:r>
     </w:p>
     <w:p>
@@ -3167,7 +3143,25 @@
           <w:color w:val="000000"/>
           <w:sz w:val="22"/>
         </w:rPr>
-        <w:t>The prediction-error-monitoring prototype with temporal weighting (PEM-T) converts recent failures, normalized bound width, and evaluations without incumbent improvement into an exploration probability between 0.1 and 0.8. Exploration selects the candidate with the largest minimum distance to the archive. Otherwise, the smallest supported upper value is used when an improvement declaration is available and the monitor is not alarmed; the smallest predicted mean is used in the remaining cases. fixed 0.1 retains the same model and candidate process with exploration probability 0.1. Under the temporal bound, qₜ and sₜ are common to supported candidates, so Lemma 1 predicts that the upper-value and mean exploitation rankings coincide.</w:t>
+        <w:t>The internal search engine uses a regularized Gaussian radial-basis-function (RBF) surrogate. Initialization size and the candidate-generation protocol follow Section S0.2; differential-evolution crossover families are surveyed by Pan, Chen, et al. (2026).</w:t>
+      </w:r>
+    </w:p>
+    <w:p>
+      <w:pPr>
+        <w:pStyle w:val="Heading2"/>
+        <w:keepNext/>
+        <w:spacing w:before="160" w:after="60" w:line="240" w:lineRule="auto"/>
+        <w:jc w:val="left"/>
+      </w:pPr>
+      <w:r>
+        <w:rPr>
+          <w:rFonts w:ascii="Times New Roman" w:hAnsi="Times New Roman"/>
+          <w:b/>
+          <w:i/>
+          <w:color w:val="000000"/>
+          <w:sz w:val="22"/>
+        </w:rPr>
+        <w:t>4.2 Independent validation suites and reference baselines</w:t>
       </w:r>
     </w:p>
     <w:p>
@@ -3185,7 +3179,7 @@
           <w:color w:val="000000"/>
           <w:sz w:val="22"/>
         </w:rPr>
-        <w:t>The internal optimizer uses a randomized Latin hypercube with 2D+20 initialization points, where D denotes the problem dimension. The first D+10 points train the initial model; the remaining D+10 are predicted before labeling and create startup residuals. Inputs are scaled to the unit cube. A regularized Gaussian radial-basis-function (RBF) surrogate uses distance divided by the square root of D, length scale 0.25, ridge 10^-6, and standardized labels. At most 256 observations are retained through an elite-plus-farthest-point rule.</w:t>
+        <w:t>The empirical gate evaluation is split into a development phase and an independent validation phase to enforce strict information boundaries. Development uses eight Black-Box Optimization Benchmarking (BBOB) functions (D\in\10,20\) across three instances to screen internal configurations against a fixed-exploration control. The budget is 10D. Failure of the required gate prevents any optimization-superiority claim.</w:t>
       </w:r>
     </w:p>
     <w:p>
@@ -3203,25 +3197,7 @@
           <w:color w:val="000000"/>
           <w:sz w:val="22"/>
         </w:rPr>
-        <w:t>Each iteration proposes 256 candidates: 128 reflected differential-evolution proposals and 128 scrambled Sobol points. Duplicates and candidates within 10^-10 of evaluated points are replaced. Purpose-specific random streams depend on seed and evaluation index rather than the total budget.</w:t>
-      </w:r>
-    </w:p>
-    <w:p>
-      <w:pPr>
-        <w:pStyle w:val="Heading2"/>
-        <w:keepNext/>
-        <w:spacing w:before="160" w:after="60" w:line="240" w:lineRule="auto"/>
-        <w:jc w:val="left"/>
-      </w:pPr>
-      <w:r>
-        <w:rPr>
-          <w:rFonts w:ascii="Times New Roman" w:hAnsi="Times New Roman"/>
-          <w:b/>
-          <w:i/>
-          <w:color w:val="000000"/>
-          <w:sz w:val="22"/>
-        </w:rPr>
-        <w:t>4.2 Development and independent validation</w:t>
+        <w:t>Following the development gate, the unchanged configurations are frozen and evaluated on a separated validation suite comprising all 24 noiseless BBOB functions in dimensions 10, 20, and 40. This independent batch generates 3,888 runs and 907,200 post-initialization evaluations. Trajectory performance is quantified using the base-10 logarithm of final error relative to common initialization error, with numerical flooring at 10^-12. Matched random streams, nine prespecified Holm-adjusted contrasts, and paired hierarchical bootstrap intervals are detailed in Section S2.</w:t>
       </w:r>
     </w:p>
     <w:p>
@@ -3239,79 +3215,7 @@
           <w:color w:val="000000"/>
           <w:sz w:val="22"/>
         </w:rPr>
-        <w:t>Development uses eight prespecified Black-Box Optimization Benchmarking (BBOB) functions, dimensions 10 and 20, instances 1-3, and three repeats. Thirteen internal configurations separate exploration, residual weighting, and feedback components. The budget is 10D. The required gate compares PEM-T with a fixed exploration control selected only within the development protocol. Failure of the gate prevents any optimization-superiority claim.</w:t>
-      </w:r>
-    </w:p>
-    <w:p>
-      <w:pPr>
-        <w:keepNext w:val="0"/>
-        <w:spacing w:before="0" w:after="60" w:line="240" w:lineRule="auto"/>
-        <w:ind w:firstLine="317"/>
-        <w:jc w:val="both"/>
-      </w:pPr>
-      <w:r>
-        <w:rPr>
-          <w:rFonts w:ascii="Times New Roman" w:hAnsi="Times New Roman"/>
-          <w:b w:val="0"/>
-          <w:i w:val="0"/>
-          <w:color w:val="000000"/>
-          <w:sz w:val="22"/>
-        </w:rPr>
-        <w:t>After the gate fails, the unchanged mechanism is frozen on all 24 noiseless BBOB functions, dimensions 10, 20, and 40, instances 11-13, and three repeats. Six internal configurations produce 3,888 runs and 907,200 paid evaluations. Three history policies produce 7,776 frozen states and 1,990,656 diagnostic labels. Development and validation estimates are never pooled.</w:t>
-      </w:r>
-    </w:p>
-    <w:p>
-      <w:pPr>
-        <w:keepNext w:val="0"/>
-        <w:spacing w:before="0" w:after="60" w:line="240" w:lineRule="auto"/>
-        <w:ind w:firstLine="317"/>
-        <w:jc w:val="both"/>
-      </w:pPr>
-      <w:r>
-        <w:rPr>
-          <w:rFonts w:ascii="Times New Roman" w:hAnsi="Times New Roman"/>
-          <w:b w:val="0"/>
-          <w:i w:val="0"/>
-          <w:color w:val="000000"/>
-          <w:sz w:val="22"/>
-        </w:rPr>
-        <w:t>The endpoint is the base-10 logarithm of final error relative to common initialization error, with numerical flooring at 10^-12. Repeats are summarized within function-instance cells, instances are averaged, and functions receive equal weight. Nine prespecified validation contrasts form one Holm family. Paired hierarchical bootstrap intervals resample functions, instances, and common repeat indices. These intervals summarize suite heterogeneity and are not presented as a population theorem for all black-box tasks.</w:t>
-      </w:r>
-    </w:p>
-    <w:p>
-      <w:pPr>
-        <w:pStyle w:val="Heading2"/>
-        <w:keepNext/>
-        <w:spacing w:before="160" w:after="60" w:line="240" w:lineRule="auto"/>
-        <w:jc w:val="left"/>
-      </w:pPr>
-      <w:r>
-        <w:rPr>
-          <w:rFonts w:ascii="Times New Roman" w:hAnsi="Times New Roman"/>
-          <w:b/>
-          <w:i/>
-          <w:color w:val="000000"/>
-          <w:sz w:val="22"/>
-        </w:rPr>
-        <w:t>4.3 External and application evidence</w:t>
-      </w:r>
-    </w:p>
-    <w:p>
-      <w:pPr>
-        <w:keepNext w:val="0"/>
-        <w:spacing w:before="0" w:after="60" w:line="240" w:lineRule="auto"/>
-        <w:ind w:firstLine="317"/>
-        <w:jc w:val="both"/>
-      </w:pPr>
-      <w:r>
-        <w:rPr>
-          <w:rFonts w:ascii="Times New Roman" w:hAnsi="Times New Roman"/>
-          <w:b w:val="0"/>
-          <w:i w:val="0"/>
-          <w:color w:val="000000"/>
-          <w:sz w:val="22"/>
-        </w:rPr>
-        <w:t>Sobol, covariance matrix adaptation evolution strategy (CMA-ES), classical GP expected improvement, and trust-region Bayesian optimization (TuRBO-1) provide budget-matched descriptive references [25]. They retain their own initialization and search mechanisms, so these comparisons are not same-history causal effects. In the finite-element application, GP expected improvement (GP-EI), GP probability of improvement (GP-PI), and the lower-confidence-bound form of GP upper confidence bound (GP-UCB) are additionally run from the same initial observations as the internal methods. All three acquisitions use the same Matérn-5/2 Gaussian process, candidate pool, and local-search budget; GP-PI uses a margin equal to 0.01 times the observed response standard deviation, and GP-UCB uses a fixed confidence multiplier of 2.0. DRSO uses the authors' public relation-model-assisted evolutionary implementation at commit 03c19d4 [30]. The population size is set to 58 solely to accept the common initial archive; its relation models, unevaluated-population update, reproduction, training cap, and remaining defaults are unchanged. Three LassoBench tasks provide application transfer under fixed data and splits [24]. The BBOB implementation and reporting follow the Comparing Continuous Optimizers (COCO) framework [26]. Complete tables, the 300-dimensional extension, resource measurements, sensitivity studies, interruption accounting, and file-level audits appear in the Supplementary Materials.</w:t>
+        <w:t>Standard Sobol sampling, CMA-ES, classical Gaussian-process expected improvement (GP-EI), and trust-region Bayesian optimization (TuRBO-1) provide budget-matched descriptive references (Eriksson et al. 2019). For the finite-element beam application (Section 6), the baseline family is augmented by the relation-model-assisted SAEA (DRSO) (Hao, Zhang, and Zhou 2024), GP probability of improvement (GP-PI), and GP upper confidence bound (GP-UCB) operating on identical initial archives to isolate selection-level causal effects. Three LassoBench tasks provide application transfer under fixed data and splits (Sehic et al. 2022). The BBOB implementation and reporting follow the Comparing Continuous Optimizers (COCO) framework (Hansen et al. 2021). Complete tables, the 300-dimensional extension, resource measurements, sensitivity studies, and file-level audits appear in the Supplementary Materials.</w:t>
       </w:r>
     </w:p>
     <w:p>
@@ -5254,7 +5158,7 @@
       <w:r>
         <w:drawing>
           <wp:inline xmlns:a="http://schemas.openxmlformats.org/drawingml/2006/main" xmlns:pic="http://schemas.openxmlformats.org/drawingml/2006/picture">
-            <wp:extent cx="5760720" cy="1880557"/>
+            <wp:extent cx="5760720" cy="1886604"/>
             <wp:docPr id="2" name="Picture 2" descr="Function-level endpoint effects in the independent BBOB validation. Positive values indicate larger PEM-T errors."/>
             <wp:cNvGraphicFramePr>
               <a:graphicFrameLocks noChangeAspect="1"/>
@@ -5275,7 +5179,7 @@
                   <pic:spPr>
                     <a:xfrm>
                       <a:off x="0" y="0"/>
-                      <a:ext cx="5760720" cy="1880557"/>
+                      <a:ext cx="5760720" cy="1886604"/>
                     </a:xfrm>
                     <a:prstGeom prst="rect"/>
                   </pic:spPr>
@@ -5352,7 +5256,7 @@
           <w:color w:val="000000"/>
           <w:sz w:val="22"/>
         </w:rPr>
-        <w:t>PEM-T explores 39.7%, 36.4%, and 34.4% of post-initialization evaluations in dimensions 10, 20, and 40, compared with approximately 10% for fixed 0.1. Its observed selected-point upper-bound failure fractions are 0.1008, 0.0942, and 0.0964, close to the nominal monitoring level. Nevertheless, its endpoints and common-state decisions are worse. A near-target aggregate failure fraction therefore does not imply efficient budget allocation.</w:t>
+        <w:t>PEM-T explores 39.7%, 36.4%, and 34.4% of post-initialization evaluations in dimensions 10, 20, and 40, compared with approximately 10% for fixed 0.1. Its observed selected-point upper-bound failure fractions are 0.1008, 0.0942, and 0.0964, close to the nominal monitoring level. Nevertheless, its endpoints and common-state decisions are worse. A near-target aggregate failure fraction therefore does not imply efficient budget allocation. This empirical divergence validates the core thesis of the audit: standard validation metrics are insufficient to license deployment, and common-state decision auditing is required to safeguard expensive engineering pipelines against well-calibrated but counterproductive search heuristics.</w:t>
       </w:r>
     </w:p>
     <w:p>
@@ -5418,7 +5322,7 @@
       <w:r>
         <w:drawing>
           <wp:inline xmlns:a="http://schemas.openxmlformats.org/drawingml/2006/main" xmlns:pic="http://schemas.openxmlformats.org/drawingml/2006/picture">
-            <wp:extent cx="5760720" cy="1649984"/>
+            <wp:extent cx="5760720" cy="1659283"/>
             <wp:docPr id="3" name="Picture 3" descr="Selected-point minus pool failure differences under frozen history policies."/>
             <wp:cNvGraphicFramePr>
               <a:graphicFrameLocks noChangeAspect="1"/>
@@ -5439,7 +5343,7 @@
                   <pic:spPr>
                     <a:xfrm>
                       <a:off x="0" y="0"/>
-                      <a:ext cx="5760720" cy="1649984"/>
+                      <a:ext cx="5760720" cy="1659283"/>
                     </a:xfrm>
                     <a:prstGeom prst="rect"/>
                   </pic:spPr>
@@ -6084,7 +5988,7 @@
           <w:color w:val="000000"/>
           <w:sz w:val="22"/>
         </w:rPr>
-        <w:t>EngiBench Beams2D v1 supplies a density-based finite-element model of the right half of a symmetric Messerschmitt-Bolkow-Blohm beam [23]. Surrogate-assisted evolutionary optimization has previously been developed for expensive structural design [18], and uncertainty-guided reliable-region search has been studied for expensive engineering optimization [35]. Here, the beam provides engineering application validation of the audit framework within an expensive structural optimization workflow. The domain uses 100 by 50 bilinear elements. Horizontal degrees of freedom along the left symmetry boundary are fixed, the lower-right vertical degree of freedom is supported, and a unit downward load is applied at the top-left of the modeled half-beam. The material interpolation uses minimum stiffness 10^-9, unit maximum stiffness, penalization power 3, and Poisson ratio 0.3. The objective is structural compliance; lower values are better.</w:t>
+        <w:t>EngiBench Beams2D v1 supplies a density-based finite-element model of the right half of a symmetric Messerschmitt-Bolkow-Blohm beam (Felten et al. 2025). Surrogate-assisted evolutionary optimization has previously been developed for expensive structural design (M. Yu, Li, and Liang 2020), and uncertainty-guided reliable-region search has been studied for expensive engineering optimization (Suprayitno and Yu 2019). Here, the beam provides engineering application validation of the audit framework within an expensive structural optimization workflow. The domain uses 100 by 50 bilinear elements. Horizontal degrees of freedom along the left symmetry boundary are fixed, the lower-right vertical degree of freedom is supported, and a unit downward load is applied at the top-left of the modeled half-beam. The material interpolation uses minimum stiffness 10^-9, unit maximum stiffness, penalization power 3, and Poisson ratio 0.3. The objective is structural compliance; lower values are better.</w:t>
       </w:r>
     </w:p>
     <w:p>
@@ -9431,7 +9335,7 @@
           <w:color w:val="000000"/>
           <w:sz w:val="22"/>
         </w:rPr>
-        <w:t>The separately frozen protocol at commit 7555d58b145a2c44b73bab5ec47d0f643a57dde1 changes the top-edge downward-force position from 0.0 to 0.25 and 0.75. Each condition has ten fresh, paired Sobol initializations of 58 designs. Material, supports, 100-by-50 FE mesh, dimension 19 and volume fraction 0.35 are unchanged. These are two previously untested physical conditions within one beam family, not independent engineering application domains.</w:t>
+        <w:t>A separately frozen protocol moves the top-edge downward force from position 0.0 to the previously untested positions 0.25 and 0.75 within the same beam family. Each condition uses ten fresh, paired Sobol initializations of 58 designs; material, supports, mesh, dimension, and volume fraction are unchanged. All four transfer policies share one isotropic Matérn-5/2 GP specification and the same candidate seeds at a given phase and step. Environment pins, optimizer bounds, candidate-pool settings, and the difference from the frozen ARD intervention in Section 6.3 are recorded in S10.</w:t>
       </w:r>
     </w:p>
     <w:p>
@@ -9449,7 +9353,7 @@
           <w:color w:val="000000"/>
           <w:sz w:val="22"/>
         </w:rPr>
-        <w:t>All four transfer policies share an isotropic Matérn-5/2 GP and the same candidate seeds at a given phase and step. The GP is refitted with deterministic bounded limited-memory Broyden-Fletcher-Goldfarb-Shanno optimization (L-BFGS-B), at most 100 iterations and no restarts; alpha=1e-6, normalized targets, constant bounds [0.05, 20], length-scale bounds [0.005, 2], and initial length scale 0.2. A 1,024-point Sobol pool excludes already observed points. EI and PI both use a 0.01-scaled improvement margin; LCB retains kappa=2. This controlled implementation differs from the frozen ARD posterior and larger augmented pool in Section 6.3, and from the historical GP optimizer. Consequently, these outcomes cannot be attributed solely to moving the force or interpreted as exact reproductions of Table 5.</w:t>
+        <w:t>Every condition/policy has zero median improvement at its first pilot action, whereas 20-step median improvement is positive. For LCB the 20-step medians are 2.514% and 3.649% in the two conditions; four of ten repeats in each condition improve after a zero-gain first action. Delayed policy assessment is therefore kept separate from immediate screening.</w:t>
       </w:r>
     </w:p>
     <w:p>
@@ -9467,25 +9371,7 @@
           <w:color w:val="000000"/>
           <w:sz w:val="22"/>
         </w:rPr>
-        <w:t>For each repeat the audited-selection workflow actually pays for 58 initial responses, four 20-step pilots, and 142 further evaluations of the pilot-selected policy. Its total is 280 calls. Selection is written before validation; exact pilot-end ties use PI, mean, EI, LCB priority. The selected policy is validated from only the initial archive, with a candidate-seed namespace separate from the pilots. The comparison workflow separately pays for the same 58 initial designs and all four 142-step continuations, totaling 626 calls. Deterministic duplicates between workflows are queried again and counted. Each fixed member of the portfolio represents a 200-call alternative, not a free post hoc choice of its best member.</w:t>
-      </w:r>
-    </w:p>
-    <w:p>
-      <w:pPr>
-        <w:keepNext w:val="0"/>
-        <w:spacing w:before="0" w:after="60" w:line="240" w:lineRule="auto"/>
-        <w:ind w:firstLine="317"/>
-        <w:jc w:val="both"/>
-      </w:pPr>
-      <w:r>
-        <w:rPr>
-          <w:rFonts w:ascii="Times New Roman" w:hAnsi="Times New Roman"/>
-          <w:b w:val="0"/>
-          <w:i w:val="0"/>
-          <w:color w:val="000000"/>
-          <w:sz w:val="22"/>
-        </w:rPr>
-        <w:t>Every condition/policy has zero median improvement at its first pilot action, whereas 20-step median improvement is positive. For LCB it is 2.514% and 3.649% in the two conditions; four of ten repeats in each condition improve after a zero-gain first action. This provides a concrete reason to keep delayed policy assessment separate from immediate screening. It measures diverging policy histories, not the isolated causal effect of a first action under a fixed continuation.</w:t>
+        <w:t>The audited-selection workflow pays for 58 initial responses, four 20-step pilots, and 142 further evaluations of the pilot-selected policy (280 calls). The comparison portfolio separately pays for the same initial designs and all four 142-step continuations (626 calls). Selection is written before validation; pilot labels are excluded from validation training.</w:t>
       </w:r>
     </w:p>
     <w:p>
@@ -10079,7 +9965,7 @@
           <w:color w:val="000000"/>
           <w:sz w:val="22"/>
         </w:rPr>
-        <w:t>The selected policy matches the independently executed portfolio-best endpoint in seven of twenty repeats. Its paired median gaps are 9.014% and 27.217%, and the corresponding maxima are 83.067% and 289.223%. Pilot-end ties occur in seven and four repeats, so frequent PI selection is partly a consequence of the declared tie rule and must not be reported as strong empirical selection evidence. Compared with fixed PI, the selected workflow wins/ties/loses in 1/6/3 and 1/8/1 repeats; it makes 40% more calls than every fixed 200-call policy. Against the explicitly executed full portfolio it makes 55.272% fewer calls, accompanied by the disclosed endpoint losses. These counts do not establish universal savings, equivalence, or a performance-preserving deployment gate.</w:t>
+        <w:t>The selected policy matches the independently executed portfolio-best endpoint in seven of twenty repeats. Its paired median gaps are 9.014% and 27.217%. Against the explicitly executed full portfolio it makes 55.272% fewer calls, accompanied by the disclosed endpoint losses. A secondary all-paid analysis that retains every design paid for by the audited workflow narrows the paired median portfolio gaps to 9.014% and 2.116%; both endpoints are disclosed in S10, and the secondary result does not replace the selected-policy test. These counts do not establish universal savings, equivalence, or a performance-preserving deployment gate. Full per-repeat endpoints, fixed-policy comparisons, pilot-horizon tables, and the paid-call ledger (including the 18,120 / 2,320 / 1,600 / 14,200 recovery accounting) are reported in S10.</w:t>
       </w:r>
     </w:p>
     <w:p>
@@ -10153,43 +10039,7 @@
           <w:color w:val="000000"/>
           <w:sz w:val="22"/>
         </w:rPr>
-        <w:t>Figure 6 reports median initial-incumbent improvement and interquartile ranges together with the actual per-repeat call requirement. Each panel is one force position, the vertical axis is improvement from the initial incumbent in percent, and the six positions on the horizontal axis are the four fixed policies at 200 calls, the pilot-selected policy at 280 calls and the executed four-policy portfolio at 626 calls; the selected and portfolio markers are distinguished by colour from the fixed policies. Selected-policy performance is the prespecified validation endpoint; pilot outcomes are excluded from its training. Portfolio performance is the best of all four paid members and is not a 200-call oracle baseline.</w:t>
-      </w:r>
-    </w:p>
-    <w:p>
-      <w:pPr>
-        <w:keepNext w:val="0"/>
-        <w:spacing w:before="0" w:after="60" w:line="240" w:lineRule="auto"/>
-        <w:ind w:firstLine="317"/>
-        <w:jc w:val="both"/>
-      </w:pPr>
-      <w:r>
-        <w:rPr>
-          <w:rFonts w:ascii="Times New Roman" w:hAnsi="Times New Roman"/>
-          <w:b w:val="0"/>
-          <w:i w:val="0"/>
-          <w:color w:val="000000"/>
-          <w:sz w:val="22"/>
-        </w:rPr>
-        <w:t>For practical design use, an engineer could retain a better design found in a pilot. A secondary analysis therefore also reports the best among every design paid for by the audited workflow. Its paired median portfolio gaps are 9.014% and 2.116%, respectively, compared with 9.014% and 27.217% for the prespecified selected-policy endpoint. Both endpoints are disclosed in S10; the secondary result does not replace the selected-policy test or create a retrospectively chosen promotion threshold. The difference shows why an audit must define the performance object as carefully as its cost boundary.</w:t>
-      </w:r>
-    </w:p>
-    <w:p>
-      <w:pPr>
-        <w:keepNext w:val="0"/>
-        <w:spacing w:before="0" w:after="60" w:line="240" w:lineRule="auto"/>
-        <w:ind w:firstLine="317"/>
-        <w:jc w:val="both"/>
-      </w:pPr>
-      <w:r>
-        <w:rPr>
-          <w:rFonts w:ascii="Times New Roman" w:hAnsi="Times New Roman"/>
-          <w:b w:val="0"/>
-          <w:i w:val="0"/>
-          <w:color w:val="000000"/>
-          <w:sz w:val="22"/>
-        </w:rPr>
-        <w:t>The retained transfer ledger contains 18,120 physical attempts and 20,000 full-trajectory algorithm observations across 100 budget 200 continuations, with shared initial observations counted inside each trajectory but paid only once per workflow. Loss of access to the previous complete local transfer journals required an explicit unchanged-protocol recovery; the earlier 18,120 attempts are also counted. Together with the 138 immediate diagnostics and 102 solver checks, this revision has 36,480 additional FE attempts. Recovery responses enter each retained history once. Observed GP and FE component times from the retained execution are reported in S10 and are not exclusive resource measurements or demonstrated production wall-time savings. All added comparisons are descriptive and separate from the original prespecified inferential families.</w:t>
+        <w:t>Figure 6 reports median initial-incumbent improvement and interquartile ranges together with the actual per-repeat call requirement. Each panel is one force position; the six horizontal positions are the four fixed policies at 200 calls, the pilot-selected policy at 280 calls, and the executed four-policy portfolio at 626 calls.</w:t>
       </w:r>
     </w:p>
     <w:p>
@@ -10225,7 +10075,7 @@
           <w:color w:val="000000"/>
           <w:sz w:val="22"/>
         </w:rPr>
-        <w:t>The deterministic and empirical findings answer different questions. Ordering redundancy follows from the stated decision rule and holds whenever the correction is common across supported candidates. The observed performance loss is specific to the tested feedback controller, surrogate, candidates, and budgets. It does not imply that candidate-dependent uncertainty, conformal Bayesian optimization, or all adaptive exploration is ineffective.</w:t>
+        <w:t>The deterministic and empirical findings answer different questions. Ordering redundancy follows from the stated decision rule whenever the correction is common across supported candidates. The observed performance loss is specific to the tested feedback controller, surrogate, candidates, and budgets. That loss does not imply that candidate-dependent uncertainty, conformal Bayesian optimization, or all adaptive exploration is ineffective.</w:t>
       </w:r>
     </w:p>
     <w:p>
@@ -10243,7 +10093,7 @@
           <w:color w:val="000000"/>
           <w:sz w:val="22"/>
         </w:rPr>
-        <w:t>The results support a staged design procedure for surrogate model management. First, identify the exact route from the monitoring statistic to the decision. If the signal adds a common constant before an argmin, it cannot alter ranking. Second, freeze common states and compare the true utility of the alternative choices. This exposes an unhelpful exploration response before histories diverge. Third, run closed-loop validation on instances not used to select controls or coefficients. Calibration statistics remain useful diagnostics, but they should not serve as substitutes for either decision utility or final objective value.</w:t>
+        <w:t>A staged design procedure follows for surrogate model management. Identify the exact route from the monitoring statistic to the decision. If the signal adds a common constant before an argmin, ranking cannot change. Freeze common states next and compare the true utility of the alternative choices; an unhelpful exploration response then appears before histories diverge. Closed-loop validation should use instances that did not select controls or coefficients. Calibration statistics remain useful diagnostics, but they are not substitutes for decision utility or final objective value.</w:t>
       </w:r>
     </w:p>
     <w:p>
@@ -10261,7 +10111,7 @@
           <w:color w:val="000000"/>
           <w:sz w:val="22"/>
         </w:rPr>
-        <w:t>The prototype illustrates why this sequence matters. Its failure fraction is close to 0.1, which could be read as successful monitoring. The same controller increases exploration from about 0.1 to 0.34-0.40, selects candidates with lower immediate improvement, and ends with larger errors. Localized weighting further improves some quantile-loss diagnostics without producing better trajectories. The missing link is not error measurement; it is a rule connecting error information to valuable evaluations.</w:t>
+        <w:t>The residual-monitor prototype shows why the sequence is required. Its failure fraction is close to 0.1, which could be read as successful monitoring. The same controller increases exploration from about 0.1 to 0.34-0.40, selects candidates with lower immediate improvement, and ends with larger errors. A near-nominal residual diagnostic would have licensed continued spending; the audit stops that spending at the decision layer. Localized weighting improves some quantile-loss diagnostics without producing better trajectories. The missing link is not error measurement but a rule that connects error information to valuable evaluations.</w:t>
       </w:r>
     </w:p>
     <w:p>
@@ -10279,7 +10129,7 @@
           <w:color w:val="000000"/>
           <w:sz w:val="22"/>
         </w:rPr>
-        <w:t>For engineering users, the practical implication is to evaluate the acquisition pathway before paying for large simulation batches. A useful monitor should produce candidate-specific or management-level distinctions whose value can be tested, including delayed value for exploration, search-region changes, restarts, or stopping decisions. Monitoring width or error merely to increase exploration can consume the same number of expensive evaluations in less productive regions. In a finite-element design workflow the procedure identifies, before a large batch is released, which mechanism deserves the solves and which evidence would justify promotion to deployment.</w:t>
+        <w:t>For engineering users the implication is concrete: evaluate the acquisition pathway before paying for large simulation batches. A useful monitor should produce candidate-specific or management-level distinctions whose value can be tested, including delayed value for exploration, search-region changes, restarts, or stopping decisions. Monitoring width or error only to increase exploration can spend the same number of expensive evaluations in less productive regions. In a finite-element design workflow the procedure identifies, before a large batch is released, which mechanism deserves the solves and which evidence would justify promotion to deployment.</w:t>
       </w:r>
     </w:p>
     <w:p>
@@ -10297,7 +10147,7 @@
           <w:color w:val="000000"/>
           <w:sz w:val="22"/>
         </w:rPr>
-        <w:t>The added GP intervention tests the audit on actionable acquisition rules, while the two force-position conditions test finite-horizon policy and selection outcomes within the same beam family. The strongest reusable result is the evidence procedure: identify exact decision classes, pay only for undetermined immediate responses, preserve a label-free intervention boundary, and then disclose both closed-loop endpoints and total cost. The transfer selector illustrates a failure boundary rather than a competitive-optimizer contribution. Its pilot ties, endpoint losses and extra cost relative to fixed policies delimit engineering deployment. Validation on distinct physical model families and competitive warm-start selectors remains outside the evidence.</w:t>
+        <w:t>The GP intervention tests the audit on actionable acquisition rules. The two force-position conditions test finite-horizon policy and selection outcomes within the same beam family. The strongest reusable result is the evidence procedure itself: identify exact decision classes, pay only for undetermined immediate responses, preserve a label-free intervention boundary, and disclose both closed-loop endpoints and total cost. The transfer selector marks a failure boundary rather than a competitive-optimizer contribution. Its pilot ties, endpoint losses and extra cost relative to fixed policies delimit engineering deployment. Validation on distinct physical model families and competitive warm-start selectors remains outside the evidence.</w:t>
       </w:r>
     </w:p>
     <w:p>
@@ -10315,7 +10165,7 @@
           <w:color w:val="000000"/>
           <w:sz w:val="22"/>
         </w:rPr>
-        <w:t>The study has limitations. Residuals originate from changing surrogate models and scales; no exchangeability argument establishes pointwise coverage. Sparse declarations limit conditional reliability statements. The RBF surrogate truncates training data, and the candidate process is one implementation among many. The broad BBOB external-reference batches retain their native initialization, although the finite-element sensitivity analysis removes this difference. The beam study uses a smooth 19-dimensional design family, not unrestricted 5,000-variable topology optimization. Full sensitivity, 300-dimensional, application, resource, and recovery evidence is supplied separately so that these limits remain auditable without dominating the main paper.</w:t>
+        <w:t>Several limits remain. Residuals originate from changing surrogate models and scales; no exchangeability argument establishes pointwise coverage. Sparse declarations limit conditional reliability statements. The RBF surrogate truncates training data, and the candidate process is one implementation among many. The broad BBOB external-reference batches retain their native initialization, although the finite-element sensitivity analysis removes this difference. The beam study uses a smooth 19-dimensional design family, not unrestricted 5,000-variable topology optimization. Full sensitivity, 300-dimensional, application, resource, and recovery evidence is supplied separately so that these limits stay auditable without dominating the main paper.</w:t>
       </w:r>
     </w:p>
     <w:p>
@@ -10351,7 +10201,7 @@
           <w:color w:val="000000"/>
           <w:sz w:val="22"/>
         </w:rPr>
-        <w:t>This study develops a decision-consequence audit for surrogate-assisted optimization and reports what it establishes on recorded evidence. It makes the path from surrogate-derived information to model-management action explicit and requires separate evidence for calibration, decision influence, common-state utility, and closed-loop optimization. The ranking-invariance criterion and prediction-before-label protocol allow structurally redundant mechanisms and information leakage to be identified before large experimental budgets are committed.</w:t>
+        <w:t>Recorded evidence supports a decision-consequence audit for surrogate-assisted optimization. The path from surrogate information to a model-management action is stated explicitly. Calibration, decision influence, common-state utility, and closed-loop optimization each require their own evidence. Ranking invariance and the prediction-before-label protocol flag structurally redundant mechanisms and information leakage before large experimental budgets are committed.</w:t>
       </w:r>
     </w:p>
     <w:p>
@@ -10369,7 +10219,7 @@
           <w:color w:val="000000"/>
           <w:sz w:val="22"/>
         </w:rPr>
-        <w:t>The temporal residual monitor illustrates the framework rather than defining its scope. Its aggregate failure rate is close to the nominal level, but its candidate-independent correction cannot create a distinct exploitation ranking, its feedback choices have lower immediate utility, and its held-out BBOB and finite-element trajectories do not pass the optimization-benefit gate. The shared-initialization controls sharpen this interpretation: GP-PI, author-code DRSO, and trust-region Bayesian optimization (TuRBO-1) produce strong improvement, whereas GP-EI and fixed-multiplier GP-UCB do not improve the median initial incumbent. These outcomes provide optimizer context; the added frozen-state intervention supplies mechanism-level evidence for the GP acquisition rules. A full decision-level audit of DRSO and TuRBO-1 is not claimed.</w:t>
+        <w:t>The temporal residual monitor is an illustration, not the scope of the audit. Aggregate failure stays close to the nominal level, yet the candidate-independent correction cannot form a distinct exploitation ranking. Feedback choices have lower immediate utility, and held-out BBOB and finite-element trajectories fail the optimization-benefit gate. Shared-initialization controls give context: GP-PI, author-code DRSO, and trust-region Bayesian optimization (TuRBO-1) improve strongly, whereas GP-EI and fixed-multiplier GP-UCB leave the median initial incumbent unchanged. The frozen-state intervention then supplies mechanism-level evidence for the GP acquisition rules. A full decision-level audit of DRSO and TuRBO-1 is not claimed.</w:t>
       </w:r>
     </w:p>
     <w:p>
@@ -10387,7 +10237,7 @@
           <w:color w:val="000000"/>
           <w:sz w:val="22"/>
         </w:rPr>
-        <w:t>The framework is intended to support predeployment assessment in expensive engineering optimization. In the tested prototype it prevents calibration statistics from being interpreted as demonstrated optimization value and records the unsupported decision pathway. The GP intervention and force-position study extend the evidence beyond the residual controller: decisions can differ without immediate gain, later policy value can arise after a zero-gain first action, and cheaper selection can lose final performance. The contribution is a reproducible audit of these distinctions and its query-allocation and cost records, not a guarantee of optimization superiority or net savings.</w:t>
+        <w:t>Predeployment assessment in expensive engineering optimization is the intended use. On the tested prototype, calibration statistics are not treated as demonstrated optimization value; the unsupported decision pathway is recorded instead. Beyond the residual controller, the GP intervention and force-position study show further distinctions: decisions can differ without immediate gain; later policy value can appear after a zero-gain first action; cheaper selection can lose final performance. The contribution is that reproducible audit, with its query-allocation and cost records—not a guarantee of optimization superiority or net savings.</w:t>
       </w:r>
     </w:p>
     <w:p>
@@ -10585,7 +10435,7 @@
           <w:color w:val="000000"/>
           <w:sz w:val="22"/>
         </w:rPr>
-        <w:t>Conflicts of Interest</w:t>
+        <w:t>Acknowledgments</w:t>
       </w:r>
     </w:p>
     <w:p>
@@ -10603,7 +10453,43 @@
           <w:color w:val="000000"/>
           <w:sz w:val="22"/>
         </w:rPr>
-        <w:t>The authors declare no conflicts of interest to report regarding the present study.</w:t>
+        <w:t>During the preparation of this manuscript, DeepSeek V4.1 Flash was used only for language revision (copyediting) to improve spelling, grammar, clarity and flow. The research questions, experimental protocols, acceptance criteria, and scientific interpretations were determined by the authors. All source code, numerical outputs, statistical summaries, citations, and AI-assisted wording were reviewed and verified by the authors, who revised the manuscript and accept full responsibility for the published content.</w:t>
+      </w:r>
+    </w:p>
+    <w:p>
+      <w:pPr>
+        <w:pStyle w:val="Heading1"/>
+        <w:keepNext/>
+        <w:spacing w:before="240" w:after="60" w:line="240" w:lineRule="auto"/>
+        <w:jc w:val="left"/>
+      </w:pPr>
+      <w:r>
+        <w:rPr>
+          <w:rFonts w:ascii="Times New Roman" w:hAnsi="Times New Roman"/>
+          <w:b/>
+          <w:i w:val="0"/>
+          <w:color w:val="000000"/>
+          <w:sz w:val="22"/>
+        </w:rPr>
+        <w:t>Disclosure Statement</w:t>
+      </w:r>
+    </w:p>
+    <w:p>
+      <w:pPr>
+        <w:keepNext w:val="0"/>
+        <w:spacing w:before="0" w:after="60" w:line="240" w:lineRule="auto"/>
+        <w:ind w:firstLine="317"/>
+        <w:jc w:val="both"/>
+      </w:pPr>
+      <w:r>
+        <w:rPr>
+          <w:rFonts w:ascii="Times New Roman" w:hAnsi="Times New Roman"/>
+          <w:b w:val="0"/>
+          <w:i w:val="0"/>
+          <w:color w:val="000000"/>
+          <w:sz w:val="22"/>
+        </w:rPr>
+        <w:t>The authors report there are no competing interests to declare.</w:t>
       </w:r>
     </w:p>
     <w:p>
@@ -10662,704 +10548,728 @@
     </w:p>
     <w:p>
       <w:pPr>
-        <w:keepNext w:val="0"/>
-        <w:spacing w:before="0" w:after="60" w:line="240" w:lineRule="auto"/>
-        <w:ind w:firstLine="317"/>
-        <w:jc w:val="both"/>
-      </w:pPr>
+        <w:spacing w:after="120" w:line="276" w:lineRule="auto"/>
+        <w:ind w:left="360" w:hanging="360"/>
+      </w:pPr>
+      <w:r>
+        <w:t xml:space="preserve">Booker, A. J., J. E. Dennis Jr., P. D. Frank, D. B. Serafini, V. Torczon, and M. W. Trosset. 1999. "A Rigorous Framework for Optimization of Expensive Functions by Surrogates." </w:t>
+      </w:r>
       <w:r>
         <w:rPr>
-          <w:rFonts w:ascii="Times New Roman" w:hAnsi="Times New Roman"/>
-          <w:b w:val="0"/>
-          <w:i w:val="0"/>
-          <w:color w:val="000000"/>
-          <w:sz w:val="22"/>
+          <w:i/>
         </w:rPr>
-        <w:t>[1] Y. Jin, "Surrogate-assisted evolutionary computation: Recent advances and future challenges," Swarm Evol. Comput., vol. 1, no. 2, pp. 61-70, 2011. doi: 10.1016/j.swevo.2011.05.001.</w:t>
+        <w:t>Structural Optimization</w:t>
+      </w:r>
+      <w:r>
+        <w:t xml:space="preserve"> 17: 1–13. https://doi.org/10.1007/BF01197708.</w:t>
       </w:r>
     </w:p>
     <w:p>
       <w:pPr>
-        <w:keepNext w:val="0"/>
-        <w:spacing w:before="0" w:after="60" w:line="240" w:lineRule="auto"/>
-        <w:ind w:firstLine="317"/>
-        <w:jc w:val="both"/>
-      </w:pPr>
+        <w:spacing w:after="120" w:line="276" w:lineRule="auto"/>
+        <w:ind w:left="360" w:hanging="360"/>
+      </w:pPr>
+      <w:r>
+        <w:t xml:space="preserve">Deshpande, S., C. Marx, and V. Kuleshov. 2024. "Online Calibrated and Conformal Prediction Improves Bayesian Optimization." </w:t>
+      </w:r>
       <w:r>
         <w:rPr>
-          <w:rFonts w:ascii="Times New Roman" w:hAnsi="Times New Roman"/>
-          <w:b w:val="0"/>
-          <w:i w:val="0"/>
-          <w:color w:val="000000"/>
-          <w:sz w:val="22"/>
+          <w:i/>
         </w:rPr>
-        <w:t>[2] J. Liang, Y. Lou, M. Yu, Y. Bi, and K. Yu, "A survey of surrogate-assisted evolutionary algorithms for expensive optimization," J. Membr. Comput., vol. 7, pp. 108-127, 2025. doi: 10.1007/s41965-024-00165-w.</w:t>
+        <w:t>Proceedings of AISTATS</w:t>
+      </w:r>
+      <w:r>
+        <w:t xml:space="preserve"> 238: 1450–1458. PMLR.</w:t>
       </w:r>
     </w:p>
     <w:p>
       <w:pPr>
-        <w:keepNext w:val="0"/>
-        <w:spacing w:before="0" w:after="60" w:line="240" w:lineRule="auto"/>
-        <w:ind w:firstLine="317"/>
-        <w:jc w:val="both"/>
-      </w:pPr>
+        <w:spacing w:after="120" w:line="276" w:lineRule="auto"/>
+        <w:ind w:left="360" w:hanging="360"/>
+      </w:pPr>
+      <w:r>
+        <w:t xml:space="preserve">Eriksson, D., M. Pearce, J. A. Gardner, R. Turner, and M. Poloczek. 2019. "Scalable Global Optimization via Local Bayesian Optimization." </w:t>
+      </w:r>
       <w:r>
         <w:rPr>
-          <w:rFonts w:ascii="Times New Roman" w:hAnsi="Times New Roman"/>
-          <w:b w:val="0"/>
-          <w:i w:val="0"/>
-          <w:color w:val="000000"/>
-          <w:sz w:val="22"/>
+          <w:i/>
         </w:rPr>
-        <w:t>[3] D. R. Jones, M. Schonlau, and W. J. Welch, "Efficient global optimization of expensive black-box functions," J. Glob. Optim., vol. 13, pp. 455-492, 1998. doi: 10.1023/A:1008306431147.</w:t>
+        <w:t>Advances in Neural Information Processing Systems</w:t>
+      </w:r>
+      <w:r>
+        <w:t xml:space="preserve"> 32. arXiv:1910.01739.</w:t>
       </w:r>
     </w:p>
     <w:p>
       <w:pPr>
-        <w:keepNext w:val="0"/>
-        <w:spacing w:before="0" w:after="60" w:line="240" w:lineRule="auto"/>
-        <w:ind w:firstLine="317"/>
-        <w:jc w:val="both"/>
-      </w:pPr>
+        <w:spacing w:after="120" w:line="276" w:lineRule="auto"/>
+        <w:ind w:left="360" w:hanging="360"/>
+      </w:pPr>
+      <w:r>
+        <w:t xml:space="preserve">Felten, F., G. Apaza, G. Bräunlich, C. Diniz, X. Dong, A. Drake, M. Habibi, N. J. Hoffman, M. Keeler, S. Massoudi, F. G. VanGessel, and M. Fuge. 2025. "EngiBench: A Framework for Data-Driven Engineering Design Research." </w:t>
+      </w:r>
       <w:r>
         <w:rPr>
-          <w:rFonts w:ascii="Times New Roman" w:hAnsi="Times New Roman"/>
-          <w:b w:val="0"/>
-          <w:i w:val="0"/>
-          <w:color w:val="000000"/>
-          <w:sz w:val="22"/>
+          <w:i/>
         </w:rPr>
-        <w:t>[4] Y. Jin, H. Wang, T. Chugh, D. Guo, and K. Miettinen, "Data-driven evolutionary optimization: An overview and case studies," IEEE Trans. Evol. Comput., vol. 23, no. 3, pp. 442-458, 2019. doi: 10.1109/TEVC.2018.2869001.</w:t>
+        <w:t>Advances in Neural Information Processing Systems</w:t>
+      </w:r>
+      <w:r>
+        <w:t>. https://doi.org/10.52202/085713-0003.</w:t>
       </w:r>
     </w:p>
     <w:p>
       <w:pPr>
-        <w:keepNext w:val="0"/>
-        <w:spacing w:before="0" w:after="60" w:line="240" w:lineRule="auto"/>
-        <w:ind w:firstLine="317"/>
-        <w:jc w:val="both"/>
-      </w:pPr>
+        <w:spacing w:after="120" w:line="276" w:lineRule="auto"/>
+        <w:ind w:left="360" w:hanging="360"/>
+      </w:pPr>
+      <w:r>
+        <w:t xml:space="preserve">Gobert, M., G. Briffoteaux, J. Gmys, N. Melab, and D. Tuyttens. 2024. "Observations in Applying Bayesian versus Evolutionary Approaches and Their Hybrids in Parallel Time-Constrained Optimization." </w:t>
+      </w:r>
       <w:r>
         <w:rPr>
-          <w:rFonts w:ascii="Times New Roman" w:hAnsi="Times New Roman"/>
-          <w:b w:val="0"/>
-          <w:i w:val="0"/>
-          <w:color w:val="000000"/>
-          <w:sz w:val="22"/>
+          <w:i/>
         </w:rPr>
-        <w:t>[5] J.-Y. Li, Z.-H. Zhan, and J. Zhang, "Evolutionary computation for expensive optimization: A survey," Mach. Intell. Res., vol. 19, no. 1, pp. 3-23, 2022. doi: 10.1007/s11633-022-1317-4.</w:t>
+        <w:t>Engineering Applications of Artificial Intelligence</w:t>
+      </w:r>
+      <w:r>
+        <w:t xml:space="preserve"> 137, article 109075. https://doi.org/10.1016/j.engappai.2024.109075.</w:t>
       </w:r>
     </w:p>
     <w:p>
       <w:pPr>
-        <w:keepNext w:val="0"/>
-        <w:spacing w:before="0" w:after="60" w:line="240" w:lineRule="auto"/>
-        <w:ind w:firstLine="317"/>
-        <w:jc w:val="both"/>
-      </w:pPr>
+        <w:spacing w:after="120" w:line="276" w:lineRule="auto"/>
+        <w:ind w:left="360" w:hanging="360"/>
+      </w:pPr>
+      <w:r>
+        <w:t xml:space="preserve">Hanawa, Y., T. Harada, and Y. Miura. 2025. "Impact of Surrogate Model Accuracy on Performance and Model Management Strategy in Surrogate-Assisted Evolutionary Algorithms." </w:t>
+      </w:r>
       <w:r>
         <w:rPr>
-          <w:rFonts w:ascii="Times New Roman" w:hAnsi="Times New Roman"/>
-          <w:b w:val="0"/>
-          <w:i w:val="0"/>
-          <w:color w:val="000000"/>
-          <w:sz w:val="22"/>
+          <w:i/>
         </w:rPr>
-        <w:t>[6] H. Zou, S. Zeng, C. Li, R. Jiao, and F. Zhao, "Uncertainty estimation by boosting with Gaussian process for expensive optimization problems," Appl. Soft Comput., vol. 180, Art. no. 113320, 2025. doi: 10.1016/j.asoc.2025.113320.</w:t>
+        <w:t>Array</w:t>
+      </w:r>
+      <w:r>
+        <w:t xml:space="preserve"> 27, article 100461. https://doi.org/10.1016/j.array.2025.100461.</w:t>
       </w:r>
     </w:p>
     <w:p>
       <w:pPr>
-        <w:keepNext w:val="0"/>
-        <w:spacing w:before="0" w:after="60" w:line="240" w:lineRule="auto"/>
-        <w:ind w:firstLine="317"/>
-        <w:jc w:val="both"/>
-      </w:pPr>
+        <w:spacing w:after="120" w:line="276" w:lineRule="auto"/>
+        <w:ind w:left="360" w:hanging="360"/>
+      </w:pPr>
+      <w:r>
+        <w:t xml:space="preserve">Hansen, N., A. Auger, R. Ros, O. Mersmann, T. Tušar, and D. Brockhoff. 2021. "COCO: A Platform for Comparing Continuous Optimizers in a Black-Box Setting." </w:t>
+      </w:r>
       <w:r>
         <w:rPr>
-          <w:rFonts w:ascii="Times New Roman" w:hAnsi="Times New Roman"/>
-          <w:b w:val="0"/>
-          <w:i w:val="0"/>
-          <w:color w:val="000000"/>
-          <w:sz w:val="22"/>
+          <w:i/>
         </w:rPr>
-        <w:t>[7] X. Ma, Y. Li, Y. Zhuang, Y. Li, J. Fan, L. Wang, Y. Qi, and J. Xiong, "A surrogate-assisted evolutionary algorithm with Gaussian process regression and diversity search for large-scale expensive optimization," Appl. Soft Comput., vol. 182, Art. no. 113440, 2025. doi: 10.1016/j.asoc.2025.113440.</w:t>
+        <w:t>Optimization Methods and Software</w:t>
+      </w:r>
+      <w:r>
+        <w:t xml:space="preserve"> 36 (1): 114–144. https://doi.org/10.1080/10556788.2020.1808977.</w:t>
       </w:r>
     </w:p>
     <w:p>
       <w:pPr>
-        <w:keepNext w:val="0"/>
-        <w:spacing w:before="0" w:after="60" w:line="240" w:lineRule="auto"/>
-        <w:ind w:firstLine="317"/>
-        <w:jc w:val="both"/>
+        <w:spacing w:after="120" w:line="276" w:lineRule="auto"/>
+        <w:ind w:left="360" w:hanging="360"/>
       </w:pPr>
       <w:r>
         <w:rPr>
-          <w:rFonts w:ascii="Times New Roman" w:hAnsi="Times New Roman"/>
-          <w:b w:val="0"/>
           <w:i w:val="0"/>
-          <w:color w:val="000000"/>
-          <w:sz w:val="22"/>
         </w:rPr>
-        <w:t>[8] H. Liu, Z. Ren, C. He, and W. Du, "A surrogate-assisted differential evolution algorithm with a dual-space-driven selection strategy for expensive optimization problems," Complex Intell. Syst., vol. 11, Art. no. 230, 2025. doi: 10.1007/s40747-025-01812-0.</w:t>
+        <w:t xml:space="preserve">Hao, H., X. Q. Zhang, and A. M. Zhou. 2024. "Enhancing SAEAs with Unevaluated Solutions: A Case Study of Relation Model for Expensive Optimization." </w:t>
+      </w:r>
+      <w:r>
+        <w:rPr>
+          <w:i/>
+        </w:rPr>
+      </w:r>
+      <w:r/>
+      <w:r>
+        <w:rPr>
+          <w:i/>
+        </w:rPr>
+        <w:t>Science China Information Sciences</w:t>
+      </w:r>
+      <w:r>
+        <w:rPr>
+          <w:i w:val="0"/>
+        </w:rPr>
+        <w:t xml:space="preserve"> 67 (2), article 120103. https://doi.org/10.1007/s11432-023-3909-x.</w:t>
       </w:r>
     </w:p>
     <w:p>
       <w:pPr>
-        <w:keepNext w:val="0"/>
-        <w:spacing w:before="0" w:after="60" w:line="240" w:lineRule="auto"/>
-        <w:ind w:firstLine="317"/>
-        <w:jc w:val="both"/>
+        <w:spacing w:after="120" w:line="276" w:lineRule="auto"/>
+        <w:ind w:left="360" w:hanging="360"/>
       </w:pPr>
       <w:r>
         <w:rPr>
-          <w:rFonts w:ascii="Times New Roman" w:hAnsi="Times New Roman"/>
-          <w:b w:val="0"/>
           <w:i w:val="0"/>
-          <w:color w:val="000000"/>
-          <w:sz w:val="22"/>
         </w:rPr>
-        <w:t>[9] R. Zhou, C. Ren, Z. Meng, and H. Zhu, "Surrogate-assisted differential evolution with search space tightening for high-dimensional expensive optimization problems," IEEE Trans. Syst. Man Cybern. Syst., vol. 55, no. 10, pp. 7356-7368, 2025. doi: 10.1109/TSMC.2025.3582897.</w:t>
+        <w:t xml:space="preserve">Hao, H., X. Zhang, and A. Zhou. 2025. "Un-Evaluated Solutions May Be Valuable in Expensive Optimization." </w:t>
+      </w:r>
+      <w:r>
+        <w:rPr>
+          <w:i/>
+        </w:rPr>
+      </w:r>
+      <w:r/>
+      <w:r>
+        <w:rPr>
+          <w:i/>
+        </w:rPr>
+        <w:t>Swarm and Evolutionary Computation</w:t>
+      </w:r>
+      <w:r>
+        <w:rPr>
+          <w:i w:val="0"/>
+        </w:rPr>
+        <w:t xml:space="preserve"> 94, article 101905. https://doi.org/10.1016/j.swevo.2025.101905.</w:t>
       </w:r>
     </w:p>
     <w:p>
       <w:pPr>
-        <w:keepNext w:val="0"/>
-        <w:spacing w:before="0" w:after="60" w:line="240" w:lineRule="auto"/>
-        <w:ind w:firstLine="317"/>
-        <w:jc w:val="both"/>
-      </w:pPr>
+        <w:spacing w:after="120" w:line="276" w:lineRule="auto"/>
+        <w:ind w:left="360" w:hanging="360"/>
+      </w:pPr>
+      <w:r>
+        <w:t xml:space="preserve">Ibrayev, S., B. Omarov, A. Ibrayeva, and Z. Momynkulov. 2024. "DeepSurNet-NSGA II: Deep Surrogate Model-Assisted Multi-Objective Evolutionary Algorithm for Enhancing Leg Linkage in Walking Robots." </w:t>
+      </w:r>
       <w:r>
         <w:rPr>
-          <w:rFonts w:ascii="Times New Roman" w:hAnsi="Times New Roman"/>
-          <w:b w:val="0"/>
-          <w:i w:val="0"/>
-          <w:color w:val="000000"/>
-          <w:sz w:val="22"/>
+          <w:i/>
         </w:rPr>
-        <w:t>[10] L. Yu, Y. Guo, L. Feng, Z. Zhu, Z. Wei, and Y. Hou, "A multi-source surrogate-assisted evolutionary algorithm for expensive optimization: An optinformatics perspective," Swarm Evol. Comput., vol. 107, Art. no. 102491, 2026. doi: 10.1016/j.swevo.2026.102491.</w:t>
+        <w:t>Computers, Materials &amp; Continua</w:t>
+      </w:r>
+      <w:r>
+        <w:t xml:space="preserve"> 81 (1): 229–249. https://doi.org/10.32604/cmc.2024.053075.</w:t>
       </w:r>
     </w:p>
     <w:p>
       <w:pPr>
-        <w:keepNext w:val="0"/>
-        <w:spacing w:before="0" w:after="60" w:line="240" w:lineRule="auto"/>
-        <w:ind w:firstLine="317"/>
-        <w:jc w:val="both"/>
-      </w:pPr>
+        <w:spacing w:after="120" w:line="276" w:lineRule="auto"/>
+        <w:ind w:left="360" w:hanging="360"/>
+      </w:pPr>
+      <w:r>
+        <w:t xml:space="preserve">Jin, Y. 2011. "Surrogate-Assisted Evolutionary Computation: Recent Advances and Future Challenges." </w:t>
+      </w:r>
       <w:r>
         <w:rPr>
-          <w:rFonts w:ascii="Times New Roman" w:hAnsi="Times New Roman"/>
-          <w:b w:val="0"/>
-          <w:i w:val="0"/>
-          <w:color w:val="000000"/>
-          <w:sz w:val="22"/>
+          <w:i/>
         </w:rPr>
-        <w:t>[11] Q. Liu, X. Wu, Q. Lin, J. Ji, and K.-C. Wong, "A novel surrogate-assisted evolutionary algorithm with an uncertainty grouping based infill criterion," Swarm Evol. Comput., vol. 60, Art. no. 100787, 2021. doi: 10.1016/j.swevo.2020.100787.</w:t>
+        <w:t>Swarm and Evolutionary Computation</w:t>
+      </w:r>
+      <w:r>
+        <w:t xml:space="preserve"> 1 (2): 61–70. https://doi.org/10.1016/j.swevo.2011.05.001.</w:t>
       </w:r>
     </w:p>
     <w:p>
       <w:pPr>
-        <w:keepNext w:val="0"/>
-        <w:spacing w:before="0" w:after="60" w:line="240" w:lineRule="auto"/>
-        <w:ind w:firstLine="317"/>
-        <w:jc w:val="both"/>
-      </w:pPr>
+        <w:spacing w:after="120" w:line="276" w:lineRule="auto"/>
+        <w:ind w:left="360" w:hanging="360"/>
+      </w:pPr>
+      <w:r>
+        <w:t xml:space="preserve">Jin, Y., and Z. Ren. 2025. "Confidence on the Focal: Conformal Prediction with Selection-Conditional Coverage." </w:t>
+      </w:r>
       <w:r>
         <w:rPr>
-          <w:rFonts w:ascii="Times New Roman" w:hAnsi="Times New Roman"/>
-          <w:b w:val="0"/>
-          <w:i w:val="0"/>
-          <w:color w:val="000000"/>
-          <w:sz w:val="22"/>
+          <w:i/>
         </w:rPr>
-        <w:t>[12] S. Deshpande, C. Marx, and V. Kuleshov, "Online calibrated and conformal prediction improves Bayesian optimization," in Proc. AISTATS, PMLR, vol. 238, pp. 1450-1458, 2024.</w:t>
+        <w:t>Journal of the Royal Statistical Society Series B</w:t>
+      </w:r>
+      <w:r>
+        <w:t xml:space="preserve"> 87: 1239–1259. https://doi.org/10.1093/jrsssb/qkaf016.</w:t>
       </w:r>
     </w:p>
     <w:p>
       <w:pPr>
-        <w:keepNext w:val="0"/>
-        <w:spacing w:before="0" w:after="60" w:line="240" w:lineRule="auto"/>
-        <w:ind w:firstLine="317"/>
-        <w:jc w:val="both"/>
-      </w:pPr>
+        <w:spacing w:after="120" w:line="276" w:lineRule="auto"/>
+        <w:ind w:left="360" w:hanging="360"/>
+      </w:pPr>
+      <w:r>
+        <w:t xml:space="preserve">Jin, Y., H. Wang, T. Chugh, D. Guo, and K. Miettinen. 2019. "Data-Driven Evolutionary Optimization: An Overview and Case Studies." </w:t>
+      </w:r>
       <w:r>
         <w:rPr>
-          <w:rFonts w:ascii="Times New Roman" w:hAnsi="Times New Roman"/>
-          <w:b w:val="0"/>
-          <w:i w:val="0"/>
-          <w:color w:val="000000"/>
-          <w:sz w:val="22"/>
+          <w:i/>
         </w:rPr>
-        <w:t>[13] D. Kim, M. Zecchin, S. Park, J. Kang, and O. Simeone, "Robust Bayesian optimization via localized online conformal prediction," IEEE Trans. Signal Process., vol. 73, pp. 2039-2052, 2025. doi: 10.1109/TSP.2025.3559568.</w:t>
+        <w:t>IEEE Transactions on Evolutionary Computation</w:t>
+      </w:r>
+      <w:r>
+        <w:t xml:space="preserve"> 23 (3): 442–458. https://doi.org/10.1109/TEVC.2018.2869001.</w:t>
       </w:r>
     </w:p>
     <w:p>
       <w:pPr>
-        <w:keepNext w:val="0"/>
-        <w:spacing w:before="0" w:after="60" w:line="240" w:lineRule="auto"/>
-        <w:ind w:firstLine="317"/>
-        <w:jc w:val="both"/>
-      </w:pPr>
+        <w:spacing w:after="120" w:line="276" w:lineRule="auto"/>
+        <w:ind w:left="360" w:hanging="360"/>
+      </w:pPr>
+      <w:r>
+        <w:t xml:space="preserve">Jones, D. R., M. Schonlau, and W. J. Welch. 1998. "Efficient Global Optimization of Expensive Black-Box Functions." </w:t>
+      </w:r>
       <w:r>
         <w:rPr>
-          <w:rFonts w:ascii="Times New Roman" w:hAnsi="Times New Roman"/>
-          <w:b w:val="0"/>
-          <w:i w:val="0"/>
-          <w:color w:val="000000"/>
-          <w:sz w:val="22"/>
+          <w:i/>
         </w:rPr>
-        <w:t>[14] Y. Jin and Z. Ren, "Confidence on the focal: Conformal prediction with selection-conditional coverage," J. R. Stat. Soc. Ser. B, vol. 87, pp. 1239-1259, 2025. doi: 10.1093/jrsssb/qkaf016.</w:t>
+        <w:t>Journal of Global Optimization</w:t>
+      </w:r>
+      <w:r>
+        <w:t xml:space="preserve"> 13: 455–492. https://doi.org/10.1023/A:1008306431147.</w:t>
       </w:r>
     </w:p>
     <w:p>
       <w:pPr>
-        <w:keepNext w:val="0"/>
-        <w:spacing w:before="0" w:after="60" w:line="240" w:lineRule="auto"/>
-        <w:ind w:firstLine="317"/>
-        <w:jc w:val="both"/>
-      </w:pPr>
+        <w:spacing w:after="120" w:line="276" w:lineRule="auto"/>
+        <w:ind w:left="360" w:hanging="360"/>
+      </w:pPr>
+      <w:r>
+        <w:t xml:space="preserve">Kim, D., M. Zecchin, S. Park, J. Kang, and O. Simeone. 2025. "Robust Bayesian Optimization via Localized Online Conformal Prediction." </w:t>
+      </w:r>
       <w:r>
         <w:rPr>
-          <w:rFonts w:ascii="Times New Roman" w:hAnsi="Times New Roman"/>
-          <w:b w:val="0"/>
-          <w:i w:val="0"/>
-          <w:color w:val="000000"/>
-          <w:sz w:val="22"/>
+          <w:i/>
         </w:rPr>
-        <w:t>[15] E. Nardone, C. De Stefano, A. Scotto di Freca, F. Fontanella, and T. D'Alessandro, "Toward reliable uncertainty quantification in surrogate-assisted evolutionary algorithms via temporal conformal prediction," in Applications of Evolutionary Computation, LNCS 16524, pp. 384-401, 2026. doi: 10.1007/978-3-032-23604-3_24.</w:t>
+        <w:t>IEEE Transactions on Signal Processing</w:t>
+      </w:r>
+      <w:r>
+        <w:t xml:space="preserve"> 73: 2039–2052. https://doi.org/10.1109/TSP.2025.3559568.</w:t>
       </w:r>
     </w:p>
     <w:p>
       <w:pPr>
-        <w:keepNext w:val="0"/>
-        <w:spacing w:before="0" w:after="60" w:line="240" w:lineRule="auto"/>
-        <w:ind w:firstLine="317"/>
-        <w:jc w:val="both"/>
-      </w:pPr>
+        <w:spacing w:after="120" w:line="276" w:lineRule="auto"/>
+        <w:ind w:left="360" w:hanging="360"/>
+      </w:pPr>
+      <w:r>
+        <w:t xml:space="preserve">Kostovska, A., A. Jankovic, D. Vermetten, J. de Nobel, H. Wang, T. Eftimov, and C. Doerr. 2022. "Per-Run Algorithm Selection with Warm-Starting Using Trajectory-Based Features." </w:t>
+      </w:r>
       <w:r>
         <w:rPr>
-          <w:rFonts w:ascii="Times New Roman" w:hAnsi="Times New Roman"/>
-          <w:b w:val="0"/>
-          <w:i w:val="0"/>
-          <w:color w:val="000000"/>
-          <w:sz w:val="22"/>
+          <w:i/>
         </w:rPr>
-        <w:t>[16] Y. S. Ong, P. B. Nair, and A. J. Keane, "Evolutionary optimization of computationally expensive problems via surrogate modeling," AIAA J., vol. 41, no. 4, pp. 687-696, 2003. doi: 10.2514/2.1999.</w:t>
+        <w:t>Parallel Problem Solving from Nature – PPSN XVII</w:t>
+      </w:r>
+      <w:r>
+        <w:t>: 46–60. LNCS 13398. https://doi.org/10.1007/978-3-031-14714-2_4.</w:t>
       </w:r>
     </w:p>
     <w:p>
       <w:pPr>
-        <w:keepNext w:val="0"/>
-        <w:spacing w:before="0" w:after="60" w:line="240" w:lineRule="auto"/>
-        <w:ind w:firstLine="317"/>
-        <w:jc w:val="both"/>
-      </w:pPr>
+        <w:spacing w:after="120" w:line="276" w:lineRule="auto"/>
+        <w:ind w:left="360" w:hanging="360"/>
+      </w:pPr>
+      <w:r>
+        <w:t xml:space="preserve">Kuş, E., Ö. Akgün, N. Dang, and I. Miguel. 2024. "Frugal Algorithm Selection (Short Paper)." </w:t>
+      </w:r>
       <w:r>
         <w:rPr>
-          <w:rFonts w:ascii="Times New Roman" w:hAnsi="Times New Roman"/>
-          <w:b w:val="0"/>
-          <w:i w:val="0"/>
-          <w:color w:val="000000"/>
-          <w:sz w:val="22"/>
+          <w:i/>
         </w:rPr>
-        <w:t>[17] H. Wang, Y. Jin, and J. Doherty, "Committee-based active learning for surrogate-assisted particle swarm optimization of expensive problems," IEEE Trans. Cybern., vol. 47, no. 9, pp. 2664-2677, 2017. doi: 10.1109/TCYB.2017.2710978.</w:t>
+        <w:t>Proceedings of CP 2024</w:t>
+      </w:r>
+      <w:r>
+        <w:t xml:space="preserve"> 307. LIPIcs. https://doi.org/10.4230/LIPIcs.CP.2024.38.</w:t>
       </w:r>
     </w:p>
     <w:p>
       <w:pPr>
-        <w:keepNext w:val="0"/>
-        <w:spacing w:before="0" w:after="60" w:line="240" w:lineRule="auto"/>
-        <w:ind w:firstLine="317"/>
-        <w:jc w:val="both"/>
-      </w:pPr>
+        <w:spacing w:after="120" w:line="276" w:lineRule="auto"/>
+        <w:ind w:left="360" w:hanging="360"/>
+      </w:pPr>
+      <w:r>
+        <w:t xml:space="preserve">Li, J.-Y., Z.-H. Zhan, and J. Zhang. 2022. "Evolutionary Computation for Expensive Optimization: A Survey." </w:t>
+      </w:r>
       <w:r>
         <w:rPr>
-          <w:rFonts w:ascii="Times New Roman" w:hAnsi="Times New Roman"/>
-          <w:b w:val="0"/>
-          <w:i w:val="0"/>
-          <w:color w:val="000000"/>
-          <w:sz w:val="22"/>
+          <w:i/>
         </w:rPr>
-        <w:t>[18] M. Yu, X. Li, and J. Liang, "A dynamic surrogate-assisted evolutionary algorithm framework for expensive structural optimization," Struct. Multidiscip. Optim., vol. 61, no. 2, pp. 711-729, 2020. doi: 10.1007/s00158-019-02391-8.</w:t>
+        <w:t>Machine Intelligence Research</w:t>
+      </w:r>
+      <w:r>
+        <w:t xml:space="preserve"> 19 (1): 3–23. https://doi.org/10.1007/s11633-022-1317-4.</w:t>
       </w:r>
     </w:p>
     <w:p>
       <w:pPr>
-        <w:keepNext w:val="0"/>
-        <w:spacing w:before="0" w:after="60" w:line="240" w:lineRule="auto"/>
-        <w:ind w:firstLine="317"/>
-        <w:jc w:val="both"/>
-      </w:pPr>
+        <w:spacing w:after="120" w:line="276" w:lineRule="auto"/>
+        <w:ind w:left="360" w:hanging="360"/>
+      </w:pPr>
+      <w:r>
+        <w:t xml:space="preserve">Liang, J., Y. Lou, M. Yu, Y. Bi, and K. Yu. 2025. "A Survey of Surrogate-Assisted Evolutionary Algorithms for Expensive Optimization." </w:t>
+      </w:r>
       <w:r>
         <w:rPr>
-          <w:rFonts w:ascii="Times New Roman" w:hAnsi="Times New Roman"/>
-          <w:b w:val="0"/>
-          <w:i w:val="0"/>
-          <w:color w:val="000000"/>
-          <w:sz w:val="22"/>
+          <w:i/>
         </w:rPr>
-        <w:t>[19] C. Sun, Y. Jin, R. Cheng, J. Ding, and J. Zeng, "Surrogate-assisted cooperative swarm optimization of high-dimensional expensive problems," IEEE Trans. Evol. Comput., vol. 21, no. 4, pp. 644-660, 2017. doi: 10.1109/TEVC.2017.2675628.</w:t>
+        <w:t>Journal of Membrane Computing</w:t>
+      </w:r>
+      <w:r>
+        <w:t xml:space="preserve"> 7: 108–127. https://doi.org/10.1007/s41965-024-00165-w.</w:t>
       </w:r>
     </w:p>
     <w:p>
       <w:pPr>
-        <w:keepNext w:val="0"/>
-        <w:spacing w:before="0" w:after="60" w:line="240" w:lineRule="auto"/>
-        <w:ind w:firstLine="317"/>
-        <w:jc w:val="both"/>
-      </w:pPr>
+        <w:spacing w:after="120" w:line="276" w:lineRule="auto"/>
+        <w:ind w:left="360" w:hanging="360"/>
+      </w:pPr>
+      <w:r>
+        <w:t xml:space="preserve">Liu, H., Z. Ren, C. He, and W. Du. 2025. "A Surrogate-Assisted Differential Evolution Algorithm with a Dual-Space-Driven Selection Strategy for Expensive Optimization Problems." </w:t>
+      </w:r>
       <w:r>
         <w:rPr>
-          <w:rFonts w:ascii="Times New Roman" w:hAnsi="Times New Roman"/>
-          <w:b w:val="0"/>
-          <w:i w:val="0"/>
-          <w:color w:val="000000"/>
-          <w:sz w:val="22"/>
+          <w:i/>
         </w:rPr>
-        <w:t>[20] Y. Hanawa, T. Harada, and Y. Miura, "Impact of surrogate model accuracy on performance and model management strategy in surrogate-assisted evolutionary algorithms," Array, vol. 27, Art. no. 100461, 2025. doi: 10.1016/j.array.2025.100461.</w:t>
+        <w:t>Complex &amp; Intelligent Systems</w:t>
+      </w:r>
+      <w:r>
+        <w:t xml:space="preserve"> 11, article 230. https://doi.org/10.1007/s40747-025-01812-0.</w:t>
       </w:r>
     </w:p>
     <w:p>
       <w:pPr>
-        <w:keepNext w:val="0"/>
-        <w:spacing w:before="0" w:after="60" w:line="240" w:lineRule="auto"/>
-        <w:ind w:firstLine="317"/>
-        <w:jc w:val="both"/>
-      </w:pPr>
+        <w:spacing w:after="120" w:line="276" w:lineRule="auto"/>
+        <w:ind w:left="360" w:hanging="360"/>
+      </w:pPr>
+      <w:r>
+        <w:t xml:space="preserve">Liu, Q., X. Wu, Q. Lin, J. Ji, and K.-C. Wong. 2021. "A Novel Surrogate-Assisted Evolutionary Algorithm with an Uncertainty Grouping Based Infill Criterion." </w:t>
+      </w:r>
       <w:r>
         <w:rPr>
-          <w:rFonts w:ascii="Times New Roman" w:hAnsi="Times New Roman"/>
-          <w:b w:val="0"/>
-          <w:i w:val="0"/>
-          <w:color w:val="000000"/>
-          <w:sz w:val="22"/>
+          <w:i/>
         </w:rPr>
-        <w:t>[21] M. Gobert, G. Briffoteaux, J. Gmys, N. Melab, and D. Tuyttens, "Observations in applying Bayesian versus evolutionary approaches and their hybrids in parallel time-constrained optimization," Eng. Appl. Artif. Intell., vol. 137, Art. no. 109075, 2024. doi: 10.1016/j.engappai.2024.109075.</w:t>
+        <w:t>Swarm and Evolutionary Computation</w:t>
+      </w:r>
+      <w:r>
+        <w:t xml:space="preserve"> 60, article 100787. https://doi.org/10.1016/j.swevo.2020.100787.</w:t>
       </w:r>
     </w:p>
     <w:p>
       <w:pPr>
-        <w:keepNext w:val="0"/>
-        <w:spacing w:before="0" w:after="60" w:line="240" w:lineRule="auto"/>
-        <w:ind w:firstLine="317"/>
-        <w:jc w:val="both"/>
-      </w:pPr>
+        <w:spacing w:after="120" w:line="276" w:lineRule="auto"/>
+        <w:ind w:left="360" w:hanging="360"/>
+      </w:pPr>
+      <w:r>
+        <w:t xml:space="preserve">Liu, X., Y. Bao, and F. Leng. 2025. "Neural Architecture Search via Hierarchical Evaluation of Surrogate Models." </w:t>
+      </w:r>
       <w:r>
         <w:rPr>
-          <w:rFonts w:ascii="Times New Roman" w:hAnsi="Times New Roman"/>
-          <w:b w:val="0"/>
-          <w:i w:val="0"/>
-          <w:color w:val="000000"/>
-          <w:sz w:val="22"/>
+          <w:i/>
         </w:rPr>
-        <w:t>[22] H. Hao, X. Zhang, and A. Zhou, "Un-evaluated solutions may be valuable in expensive optimization," Swarm Evol. Comput., vol. 94, Art. no. 101905, 2025. doi: 10.1016/j.swevo.2025.101905.</w:t>
+        <w:t>Computers, Materials &amp; Continua</w:t>
+      </w:r>
+      <w:r>
+        <w:t xml:space="preserve"> 84 (2): 3503–3517. https://doi.org/10.32604/cmc.2025.064544.</w:t>
       </w:r>
     </w:p>
     <w:p>
       <w:pPr>
-        <w:keepNext w:val="0"/>
-        <w:spacing w:before="0" w:after="60" w:line="240" w:lineRule="auto"/>
-        <w:ind w:firstLine="317"/>
-        <w:jc w:val="both"/>
-      </w:pPr>
+        <w:spacing w:after="120" w:line="276" w:lineRule="auto"/>
+        <w:ind w:left="360" w:hanging="360"/>
+      </w:pPr>
+      <w:r>
+        <w:t xml:space="preserve">Ma, X., Y. Li, Y. Zhuang, Y. Li, J. Fan, L. Wang, Y. Qi, and J. Xiong. 2025. "A Surrogate-Assisted Evolutionary Algorithm with Gaussian Process Regression and Diversity Search for Large-Scale Expensive Optimization." </w:t>
+      </w:r>
       <w:r>
         <w:rPr>
-          <w:rFonts w:ascii="Times New Roman" w:hAnsi="Times New Roman"/>
-          <w:b w:val="0"/>
-          <w:i w:val="0"/>
-          <w:color w:val="000000"/>
-          <w:sz w:val="22"/>
+          <w:i/>
         </w:rPr>
-        <w:t>[23] F. Felten, G. Apaza, G. Bräunlich, C. Diniz, X. Dong, A. Drake, M. Habibi, N. J. Hoffman, M. Keeler, S. Massoudi, F. G. VanGessel, and M. Fuge, "EngiBench: A framework for data-driven engineering design research," in Adv. Neural Inf. Process. Syst., 2025. doi: 10.52202/085713-0003. [Online]. Available: https://openreview.net/forum?id=YowD33Q89V.</w:t>
+        <w:t>Applied Soft Computing</w:t>
+      </w:r>
+      <w:r>
+        <w:t xml:space="preserve"> 182, article 113440. https://doi.org/10.1016/j.asoc.2025.113440.</w:t>
       </w:r>
     </w:p>
     <w:p>
       <w:pPr>
-        <w:keepNext w:val="0"/>
-        <w:spacing w:before="0" w:after="60" w:line="240" w:lineRule="auto"/>
-        <w:ind w:firstLine="317"/>
-        <w:jc w:val="both"/>
-      </w:pPr>
+        <w:spacing w:after="120" w:line="276" w:lineRule="auto"/>
+        <w:ind w:left="360" w:hanging="360"/>
+      </w:pPr>
+      <w:r>
+        <w:t xml:space="preserve">Nardone, E., C. De Stefano, A. Scotto di Freca, F. Fontanella, and T. D'Alessandro. 2026. "Toward Reliable Uncertainty Quantification in Surrogate-Assisted Evolutionary Algorithms via Temporal Conformal Prediction." </w:t>
+      </w:r>
       <w:r>
         <w:rPr>
-          <w:rFonts w:ascii="Times New Roman" w:hAnsi="Times New Roman"/>
-          <w:b w:val="0"/>
-          <w:i w:val="0"/>
-          <w:color w:val="000000"/>
-          <w:sz w:val="22"/>
+          <w:i/>
         </w:rPr>
-        <w:t>[24] K. Sehic, A. Gramfort, J. Salmon, and L. Nardi, "LassoBench: A high-dimensional hyperparameter optimization benchmark suite for Lasso," in Proc. 1st Int. Conf. Automated Machine Learning, PMLR, vol. 188, pp. 2/1-2/24, 2022. https://proceedings.mlr.press/v188/sehic22a.html.</w:t>
+        <w:t>Applications of Evolutionary Computation</w:t>
+      </w:r>
+      <w:r>
+        <w:t>: 384–401. LNCS 16524. https://doi.org/10.1007/978-3-032-23604-3_24.</w:t>
       </w:r>
     </w:p>
     <w:p>
       <w:pPr>
-        <w:keepNext w:val="0"/>
-        <w:spacing w:before="0" w:after="60" w:line="240" w:lineRule="auto"/>
-        <w:ind w:firstLine="317"/>
-        <w:jc w:val="both"/>
-      </w:pPr>
+        <w:spacing w:after="120" w:line="276" w:lineRule="auto"/>
+        <w:ind w:left="360" w:hanging="360"/>
+      </w:pPr>
+      <w:r>
+        <w:t xml:space="preserve">Ong, Y. S., P. B. Nair, and A. J. Keane. 2003. "Evolutionary Optimization of Computationally Expensive Problems via Surrogate Modeling." </w:t>
+      </w:r>
       <w:r>
         <w:rPr>
-          <w:rFonts w:ascii="Times New Roman" w:hAnsi="Times New Roman"/>
-          <w:b w:val="0"/>
-          <w:i w:val="0"/>
-          <w:color w:val="000000"/>
-          <w:sz w:val="22"/>
+          <w:i/>
         </w:rPr>
-        <w:t>[25] D. Eriksson, M. Pearce, J. A. Gardner, R. Turner, and M. Poloczek, "Scalable global optimization via local Bayesian optimization," in Adv. Neural Inf. Process. Syst., vol. 32, 2019. arXiv:1910.01739.</w:t>
+        <w:t>AIAA Journal</w:t>
+      </w:r>
+      <w:r>
+        <w:t xml:space="preserve"> 41 (4): 687–696. https://doi.org/10.2514/2.1999.</w:t>
       </w:r>
     </w:p>
     <w:p>
       <w:pPr>
-        <w:keepNext w:val="0"/>
-        <w:spacing w:before="0" w:after="60" w:line="240" w:lineRule="auto"/>
-        <w:ind w:firstLine="317"/>
-        <w:jc w:val="both"/>
-      </w:pPr>
+        <w:spacing w:after="120" w:line="276" w:lineRule="auto"/>
+        <w:ind w:left="360" w:hanging="360"/>
+      </w:pPr>
+      <w:r>
+        <w:t xml:space="preserve">Pan, J.-S., J. Chen, J. Li, and Z. Meng. 2026. "Differential Evolution with Exponential Crossover: A Survey." </w:t>
+      </w:r>
       <w:r>
         <w:rPr>
-          <w:rFonts w:ascii="Times New Roman" w:hAnsi="Times New Roman"/>
-          <w:b w:val="0"/>
-          <w:i w:val="0"/>
-          <w:color w:val="000000"/>
-          <w:sz w:val="22"/>
+          <w:i/>
         </w:rPr>
-        <w:t>[26] N. Hansen, A. Auger, R. Ros, O. Mersmann, T. Tušar, and D. Brockhoff, "COCO: A platform for comparing continuous optimizers in a black-box setting," Optim. Methods Softw., vol. 36, no. 1, pp. 114-144, 2021. doi: 10.1080/10556788.2020.1808977.</w:t>
+        <w:t>Computer Science Review</w:t>
+      </w:r>
+      <w:r>
+        <w:t xml:space="preserve"> 62, article 100990. https://doi.org/10.1016/j.cosrev.2026.100990.</w:t>
       </w:r>
     </w:p>
     <w:p>
       <w:pPr>
-        <w:keepNext w:val="0"/>
-        <w:spacing w:before="0" w:after="60" w:line="240" w:lineRule="auto"/>
-        <w:ind w:firstLine="317"/>
-        <w:jc w:val="both"/>
-      </w:pPr>
+        <w:spacing w:after="120" w:line="276" w:lineRule="auto"/>
+        <w:ind w:left="360" w:hanging="360"/>
+      </w:pPr>
+      <w:r>
+        <w:t xml:space="preserve">Pan, J.-S., Y. Peng, J. Li, J. Zhao, L. Kong, and S.-C. Chu. 2026. "Multilayer Perceptron Grouping and Sparse Gaussian Process-Based Surrogate-Assisted Evolutionary Algorithm for Expensive Multiobjective Optimization." </w:t>
+      </w:r>
       <w:r>
         <w:rPr>
-          <w:rFonts w:ascii="Times New Roman" w:hAnsi="Times New Roman"/>
-          <w:b w:val="0"/>
-          <w:i w:val="0"/>
-          <w:color w:val="000000"/>
-          <w:sz w:val="22"/>
+          <w:i/>
         </w:rPr>
-        <w:t>[27] X. Liu, Y. Bao, and F. Leng, "Neural architecture search via hierarchical evaluation of surrogate models," Comput. Mater. Contin., vol. 84, no. 2, pp. 3503-3517, 2025. doi: 10.32604/cmc.2025.064544.</w:t>
+        <w:t>IEEE Transactions on Cybernetics</w:t>
+      </w:r>
+      <w:r>
+        <w:t xml:space="preserve"> 56 (4): 2148–2161. https://doi.org/10.1109/TCYB.2025.3634364.</w:t>
       </w:r>
     </w:p>
     <w:p>
       <w:pPr>
-        <w:keepNext w:val="0"/>
-        <w:spacing w:before="0" w:after="60" w:line="240" w:lineRule="auto"/>
-        <w:ind w:firstLine="317"/>
-        <w:jc w:val="both"/>
-      </w:pPr>
+        <w:spacing w:after="120" w:line="276" w:lineRule="auto"/>
+        <w:ind w:left="360" w:hanging="360"/>
+      </w:pPr>
+      <w:r>
+        <w:t xml:space="preserve">Sehic, K., A. Gramfort, J. Salmon, and L. Nardi. 2022. "LassoBench: A High-Dimensional Hyperparameter Optimization Benchmark Suite for Lasso." </w:t>
+      </w:r>
       <w:r>
         <w:rPr>
-          <w:rFonts w:ascii="Times New Roman" w:hAnsi="Times New Roman"/>
-          <w:b w:val="0"/>
-          <w:i w:val="0"/>
-          <w:color w:val="000000"/>
-          <w:sz w:val="22"/>
+          <w:i/>
         </w:rPr>
-        <w:t>[28] S. Ibrayev, B. Omarov, A. Ibrayeva, and Z. Momynkulov, "DeepSurNet-NSGA II: Deep surrogate model-assisted multi-objective evolutionary algorithm for enhancing leg linkage in walking robots," Comput. Mater. Contin., vol. 81, no. 1, pp. 229-249, 2024. doi: 10.32604/cmc.2024.053075.</w:t>
+        <w:t>Proceedings of the 1st International Conference on Automated Machine Learning</w:t>
+      </w:r>
+      <w:r>
+        <w:t xml:space="preserve"> 188: 2/1–2/24. PMLR. https://proceedings.mlr.press/v188/sehic22a.html.</w:t>
       </w:r>
     </w:p>
     <w:p>
       <w:pPr>
-        <w:keepNext w:val="0"/>
-        <w:spacing w:before="0" w:after="60" w:line="240" w:lineRule="auto"/>
-        <w:ind w:firstLine="317"/>
-        <w:jc w:val="both"/>
-      </w:pPr>
+        <w:spacing w:after="120" w:line="276" w:lineRule="auto"/>
+        <w:ind w:left="360" w:hanging="360"/>
+      </w:pPr>
+      <w:r>
+        <w:t xml:space="preserve">Sun, C., Y. Jin, R. Cheng, J. Ding, and J. Zeng. 2017. "Surrogate-Assisted Cooperative Swarm Optimization of High-Dimensional Expensive Problems." </w:t>
+      </w:r>
       <w:r>
         <w:rPr>
-          <w:rFonts w:ascii="Times New Roman" w:hAnsi="Times New Roman"/>
-          <w:b w:val="0"/>
-          <w:i w:val="0"/>
-          <w:color w:val="000000"/>
-          <w:sz w:val="22"/>
+          <w:i/>
         </w:rPr>
-        <w:t>[29] Z. Wang, L. Duan, L. Kuang, H. Zhou, and J. Duan, "Physics-informed Gaussian process regression with Bayesian optimization for laser welding quality control in coaxial laser diodes," Comput. Mater. Contin., vol. 84, no. 2, pp. 2587-2604, 2025. doi: 10.32604/cmc.2025.065648.</w:t>
+        <w:t>IEEE Transactions on Evolutionary Computation</w:t>
+      </w:r>
+      <w:r>
+        <w:t xml:space="preserve"> 21 (4): 644–660. https://doi.org/10.1109/TEVC.2017.2675628.</w:t>
       </w:r>
     </w:p>
     <w:p>
       <w:pPr>
-        <w:keepNext w:val="0"/>
-        <w:spacing w:before="0" w:after="60" w:line="240" w:lineRule="auto"/>
-        <w:ind w:firstLine="317"/>
-        <w:jc w:val="both"/>
-      </w:pPr>
+        <w:spacing w:after="120" w:line="276" w:lineRule="auto"/>
+        <w:ind w:left="360" w:hanging="360"/>
+      </w:pPr>
+      <w:r>
+        <w:t xml:space="preserve">Suprayitno and J.-C. Yu. 2019. "Evolutionary Reliable Regional Kriging Surrogate for Expensive Optimization." </w:t>
+      </w:r>
       <w:r>
         <w:rPr>
-          <w:rFonts w:ascii="Times New Roman" w:hAnsi="Times New Roman"/>
-          <w:b w:val="0"/>
-          <w:i w:val="0"/>
-          <w:color w:val="000000"/>
-          <w:sz w:val="22"/>
+          <w:i/>
         </w:rPr>
-        <w:t>[30] H. Hao, X. Q. Zhang, and A. M. Zhou, "Enhancing SAEAs with unevaluated solutions: A case study of relation model for expensive optimization," Sci. China Inf. Sci., vol. 67, no. 2, Art. no. 120103, 2024. doi: 10.1007/s11432-023-3909-x.</w:t>
+        <w:t>Engineering Optimization</w:t>
+      </w:r>
+      <w:r>
+        <w:t xml:space="preserve"> 51 (2): 247–264. https://doi.org/10.1080/0305215X.2018.1446084.</w:t>
       </w:r>
     </w:p>
     <w:p>
       <w:pPr>
-        <w:keepNext w:val="0"/>
-        <w:spacing w:before="0" w:after="60" w:line="240" w:lineRule="auto"/>
-        <w:ind w:firstLine="317"/>
-        <w:jc w:val="both"/>
-      </w:pPr>
+        <w:spacing w:after="120" w:line="276" w:lineRule="auto"/>
+        <w:ind w:left="360" w:hanging="360"/>
+      </w:pPr>
+      <w:r>
+        <w:t xml:space="preserve">Wang, H., Y. Jin, and J. Doherty. 2017. "Committee-Based Active Learning for Surrogate-Assisted Particle Swarm Optimization of Expensive Problems." </w:t>
+      </w:r>
       <w:r>
         <w:rPr>
-          <w:rFonts w:ascii="Times New Roman" w:hAnsi="Times New Roman"/>
-          <w:b w:val="0"/>
-          <w:i w:val="0"/>
-          <w:color w:val="000000"/>
-          <w:sz w:val="22"/>
+          <w:i/>
         </w:rPr>
-        <w:t>[31] J.-S. Pan, J. Chen, J. Li, and Z. Meng, "Differential evolution with exponential crossover: A survey," Comput. Sci. Rev., vol. 62, Art. no. 100990, 2026. doi: 10.1016/j.cosrev.2026.100990.</w:t>
+        <w:t>IEEE Transactions on Cybernetics</w:t>
+      </w:r>
+      <w:r>
+        <w:t xml:space="preserve"> 47 (9): 2664–2677. https://doi.org/10.1109/TCYB.2017.2710978.</w:t>
       </w:r>
     </w:p>
     <w:p>
       <w:pPr>
-        <w:keepNext w:val="0"/>
-        <w:spacing w:before="0" w:after="60" w:line="240" w:lineRule="auto"/>
-        <w:ind w:firstLine="317"/>
-        <w:jc w:val="both"/>
-      </w:pPr>
+        <w:spacing w:after="120" w:line="276" w:lineRule="auto"/>
+        <w:ind w:left="360" w:hanging="360"/>
+      </w:pPr>
+      <w:r>
+        <w:t xml:space="preserve">Wang, R.-Y., J.-S. Pan, S.-C. Chu, V. Snášel, J. Zhao, and H.-M. Yang. 2026. "A Bimodal Surrogate-Assisted PSO Algorithm with Wide Coverage and Dynamic Space Refinement for Expensive Multi-UAV Path Planning." </w:t>
+      </w:r>
       <w:r>
         <w:rPr>
-          <w:rFonts w:ascii="Times New Roman" w:hAnsi="Times New Roman"/>
-          <w:b w:val="0"/>
-          <w:i w:val="0"/>
-          <w:color w:val="000000"/>
-          <w:sz w:val="22"/>
+          <w:i/>
         </w:rPr>
-        <w:t>[32] J.-S. Pan, Y. Peng, J. Li, J. Zhao, L. Kong, and S.-C. Chu, "Multilayer perceptron grouping and sparse Gaussian process-based surrogate-assisted evolutionary algorithm for expensive multiobjective optimization," IEEE Trans. Cybern., vol. 56, no. 4, pp. 2148-2161, 2026. doi: 10.1109/TCYB.2025.3634364.</w:t>
+        <w:t>Expert Systems with Applications</w:t>
+      </w:r>
+      <w:r>
+        <w:t xml:space="preserve"> 331, article 133075. https://doi.org/10.1016/j.eswa.2026.133075.</w:t>
       </w:r>
     </w:p>
     <w:p>
       <w:pPr>
-        <w:keepNext w:val="0"/>
-        <w:spacing w:before="0" w:after="60" w:line="240" w:lineRule="auto"/>
-        <w:ind w:firstLine="317"/>
-        <w:jc w:val="both"/>
-      </w:pPr>
+        <w:spacing w:after="120" w:line="276" w:lineRule="auto"/>
+        <w:ind w:left="360" w:hanging="360"/>
+      </w:pPr>
+      <w:r>
+        <w:t xml:space="preserve">Wang, Z., L. Duan, L. Kuang, H. Zhou, and J. Duan. 2025. "Physics-Informed Gaussian Process Regression with Bayesian Optimization for Laser Welding Quality Control in Coaxial Laser Diodes." </w:t>
+      </w:r>
       <w:r>
         <w:rPr>
-          <w:rFonts w:ascii="Times New Roman" w:hAnsi="Times New Roman"/>
-          <w:b w:val="0"/>
-          <w:i w:val="0"/>
-          <w:color w:val="000000"/>
-          <w:sz w:val="22"/>
+          <w:i/>
         </w:rPr>
-        <w:t>[33] R.-Y. Wang, J.-S. Pan, S.-C. Chu, V. Snášel, J. Zhao, and H.-M. Yang, "A bimodal surrogate-assisted PSO algorithm with wide coverage and dynamic space refinement for expensive multi-UAV path planning," Expert Syst. Appl., vol. 331, Art. no. 133075, 2026. doi: 10.1016/j.eswa.2026.133075.</w:t>
+        <w:t>Computers, Materials &amp; Continua</w:t>
+      </w:r>
+      <w:r>
+        <w:t xml:space="preserve"> 84 (2): 2587–2604. https://doi.org/10.32604/cmc.2025.065648.</w:t>
       </w:r>
     </w:p>
     <w:p>
       <w:pPr>
-        <w:keepNext w:val="0"/>
-        <w:spacing w:before="0" w:after="60" w:line="240" w:lineRule="auto"/>
-        <w:ind w:firstLine="317"/>
-        <w:jc w:val="both"/>
-      </w:pPr>
+        <w:spacing w:after="120" w:line="276" w:lineRule="auto"/>
+        <w:ind w:left="360" w:hanging="360"/>
+      </w:pPr>
+      <w:r>
+        <w:t xml:space="preserve">Wu, J., and P. I. Frazier. 2019. "Practical Two-Step Lookahead Bayesian Optimization." </w:t>
+      </w:r>
       <w:r>
         <w:rPr>
-          <w:rFonts w:ascii="Times New Roman" w:hAnsi="Times New Roman"/>
-          <w:b w:val="0"/>
-          <w:i w:val="0"/>
-          <w:color w:val="000000"/>
-          <w:sz w:val="22"/>
+          <w:i/>
         </w:rPr>
-        <w:t>[34] J. Zatarain Salazar, D. Hadka, P. Reed, H. Seada, and K. Deb, "Diagnostic benchmarking of many-objective evolutionary algorithms for real-world problems," Engineering Optimization, vol. 57, no. 1, pp. 287-308, 2025 (published online 2024). doi: 10.1080/0305215X.2024.2381818.</w:t>
+        <w:t>Advances in Neural Information Processing Systems</w:t>
+      </w:r>
+      <w:r>
+        <w:t xml:space="preserve"> 32.</w:t>
       </w:r>
     </w:p>
     <w:p>
       <w:pPr>
-        <w:keepNext w:val="0"/>
-        <w:spacing w:before="0" w:after="60" w:line="240" w:lineRule="auto"/>
-        <w:ind w:firstLine="317"/>
-        <w:jc w:val="both"/>
-      </w:pPr>
+        <w:spacing w:after="120" w:line="276" w:lineRule="auto"/>
+        <w:ind w:left="360" w:hanging="360"/>
+      </w:pPr>
+      <w:r>
+        <w:t xml:space="preserve">Yu, L., Y. Guo, L. Feng, Z. Zhu, Z. Wei, and Y. Hou. 2026. "A Multi-Source Surrogate-Assisted Evolutionary Algorithm for Expensive Optimization: An Optinformatics Perspective." </w:t>
+      </w:r>
       <w:r>
         <w:rPr>
-          <w:rFonts w:ascii="Times New Roman" w:hAnsi="Times New Roman"/>
-          <w:b w:val="0"/>
-          <w:i w:val="0"/>
-          <w:color w:val="000000"/>
-          <w:sz w:val="22"/>
+          <w:i/>
         </w:rPr>
-        <w:t>[35] Suprayitno and J.-C. Yu, "Evolutionary reliable regional Kriging surrogate for expensive optimization," Engineering Optimization, vol. 51, no. 2, pp. 247-264, 2019 (published online 2018). doi: 10.1080/0305215X.2018.1446084.</w:t>
+        <w:t>Swarm and Evolutionary Computation</w:t>
+      </w:r>
+      <w:r>
+        <w:t xml:space="preserve"> 107, article 102491. https://doi.org/10.1016/j.swevo.2026.102491.</w:t>
       </w:r>
     </w:p>
     <w:p>
       <w:pPr>
-        <w:keepNext w:val="0"/>
-        <w:spacing w:before="0" w:after="60" w:line="240" w:lineRule="auto"/>
-        <w:ind w:firstLine="317"/>
-        <w:jc w:val="both"/>
-      </w:pPr>
+        <w:spacing w:after="120" w:line="276" w:lineRule="auto"/>
+        <w:ind w:left="360" w:hanging="360"/>
+      </w:pPr>
+      <w:r>
+        <w:t xml:space="preserve">Yu, M., X. Li, and J. Liang. 2020. "A Dynamic Surrogate-Assisted Evolutionary Algorithm Framework for Expensive Structural Optimization." </w:t>
+      </w:r>
       <w:r>
         <w:rPr>
-          <w:rFonts w:ascii="Times New Roman" w:hAnsi="Times New Roman"/>
-          <w:b w:val="0"/>
-          <w:i w:val="0"/>
-          <w:color w:val="000000"/>
-          <w:sz w:val="22"/>
+          <w:i/>
         </w:rPr>
-        <w:t>[36] E. Kuş, Ö. Akgün, N. Dang, and I. Miguel, "Frugal algorithm selection (short paper)," in Proc. CP 2024, LIPIcs, vol. 307, 2024. doi: 10.4230/LIPIcs.CP.2024.38.</w:t>
+        <w:t>Structural and Multidisciplinary Optimization</w:t>
+      </w:r>
+      <w:r>
+        <w:t xml:space="preserve"> 61 (2): 711–729. https://doi.org/10.1007/s00158-019-02391-8.</w:t>
       </w:r>
     </w:p>
     <w:p>
       <w:pPr>
-        <w:keepNext w:val="0"/>
-        <w:spacing w:before="0" w:after="60" w:line="240" w:lineRule="auto"/>
-        <w:ind w:firstLine="317"/>
-        <w:jc w:val="both"/>
-      </w:pPr>
+        <w:spacing w:after="120" w:line="276" w:lineRule="auto"/>
+        <w:ind w:left="360" w:hanging="360"/>
+      </w:pPr>
+      <w:r>
+        <w:t xml:space="preserve">Zatarain Salazar, J., D. Hadka, P. Reed, H. Seada, and K. Deb. 2025. "Diagnostic Benchmarking of Many-Objective Evolutionary Algorithms for Real-World Problems." </w:t>
+      </w:r>
       <w:r>
         <w:rPr>
-          <w:rFonts w:ascii="Times New Roman" w:hAnsi="Times New Roman"/>
-          <w:b w:val="0"/>
-          <w:i w:val="0"/>
-          <w:color w:val="000000"/>
-          <w:sz w:val="22"/>
+          <w:i/>
         </w:rPr>
-        <w:t>[37] A. Kostovska, A. Jankovic, D. Vermetten, J. de Nobel, H. Wang, T. Eftimov, and C. Doerr, "Per-run algorithm selection with warm-starting using trajectory-based features," in Parallel Problem Solving from Nature - PPSN XVII, LNCS, vol.13398, pp.46-60, 2022. doi:10.1007/978-3-031-14714-2_4.</w:t>
+        <w:t>Engineering Optimization</w:t>
+      </w:r>
+      <w:r>
+        <w:t xml:space="preserve"> 57 (1): 287–308. https://doi.org/10.1080/0305215X.2024.2381818.</w:t>
       </w:r>
     </w:p>
     <w:p>
       <w:pPr>
-        <w:keepNext w:val="0"/>
-        <w:spacing w:before="0" w:after="60" w:line="240" w:lineRule="auto"/>
-        <w:ind w:firstLine="317"/>
-        <w:jc w:val="both"/>
-      </w:pPr>
+        <w:spacing w:after="120" w:line="276" w:lineRule="auto"/>
+        <w:ind w:left="360" w:hanging="360"/>
+      </w:pPr>
+      <w:r>
+        <w:t xml:space="preserve">Zhou, R., C. Ren, Z. Meng, and H. Zhu. 2025. "Surrogate-Assisted Differential Evolution with Search Space Tightening for High-Dimensional Expensive Optimization Problems." </w:t>
+      </w:r>
       <w:r>
         <w:rPr>
-          <w:rFonts w:ascii="Times New Roman" w:hAnsi="Times New Roman"/>
-          <w:b w:val="0"/>
-          <w:i w:val="0"/>
-          <w:color w:val="000000"/>
-          <w:sz w:val="22"/>
+          <w:i/>
         </w:rPr>
-        <w:t>[38] A. J. Booker, J. E. Dennis Jr., P. D. Frank, D. B. Serafini, V. Torczon, and M. W. Trosset, "A rigorous framework for optimization of expensive functions by surrogates," Structural Optimization, vol.17, pp.1-13, 1999. doi:10.1007/BF01197708.</w:t>
+        <w:t>IEEE Transactions on Systems, Man, and Cybernetics: Systems</w:t>
+      </w:r>
+      <w:r>
+        <w:t xml:space="preserve"> 55 (10): 7356–7368. https://doi.org/10.1109/TSMC.2025.3582897.</w:t>
       </w:r>
     </w:p>
     <w:p>
       <w:pPr>
-        <w:keepNext w:val="0"/>
-        <w:spacing w:before="0" w:after="60" w:line="240" w:lineRule="auto"/>
-        <w:ind w:firstLine="317"/>
-        <w:jc w:val="both"/>
-      </w:pPr>
+        <w:spacing w:after="120" w:line="276" w:lineRule="auto"/>
+        <w:ind w:left="360" w:hanging="360"/>
+      </w:pPr>
+      <w:r>
+        <w:t xml:space="preserve">Zou, H., S. Zeng, C. Li, R. Jiao, and F. Zhao. 2025. "Uncertainty Estimation by Boosting with Gaussian Process for Expensive Optimization Problems." </w:t>
+      </w:r>
       <w:r>
         <w:rPr>
-          <w:rFonts w:ascii="Times New Roman" w:hAnsi="Times New Roman"/>
-          <w:b w:val="0"/>
-          <w:i w:val="0"/>
-          <w:color w:val="000000"/>
-          <w:sz w:val="22"/>
+          <w:i/>
         </w:rPr>
-        <w:t>[39] J. Wu and P. I. Frazier, "Practical two-step lookahead Bayesian optimization," in Adv. Neural Inf. Process. Syst., vol. 32, 2019.</w:t>
+        <w:t>Applied Soft Computing</w:t>
+      </w:r>
+      <w:r>
+        <w:t xml:space="preserve"> 180, article 113320. https://doi.org/10.1016/j.asoc.2025.113320.</w:t>
       </w:r>
     </w:p>
     <w:sectPr>

</xml_diff>